<commit_message>
updated configuration managament plan
</commit_message>
<xml_diff>
--- a/doc/IEEE Configuration Management.docx
+++ b/doc/IEEE Configuration Management.docx
@@ -5730,8 +5730,8 @@
       <w:r>
         <w:tab/>
       </w:r>
-      <w:smartTag w:uri="urn:schemas-microsoft-com:office:smarttags" w:element="place">
-        <w:smartTag w:uri="urn:schemas-microsoft-com:office:smarttags" w:element="City">
+      <w:smartTag w:uri="urn:schemas-microsoft-com:office:smarttags" w:element="City">
+        <w:smartTag w:uri="urn:schemas-microsoft-com:office:smarttags" w:element="place">
           <w:r>
             <w:t>Davis</w:t>
           </w:r>
@@ -5875,33 +5875,6 @@
       <w:bookmarkEnd w:id="61"/>
       <w:bookmarkEnd w:id="62"/>
       <w:bookmarkEnd w:id="63"/>
-    </w:p>
-    <w:p/>
-    <w:p>
-      <w:r>
-        <w:t xml:space="preserve">[The SCM organizational context must be described. The Plan should identify </w:t>
-      </w:r>
-      <w:proofErr w:type="gramStart"/>
-      <w:r>
-        <w:t>the all</w:t>
-      </w:r>
-      <w:proofErr w:type="gramEnd"/>
-      <w:r>
-        <w:t xml:space="preserve"> participants, or those responsible for any SCM activity on the project.  All functional roles should be described, as well as any relationships to external organizations. Organization charts, supplemented by statements of function and relationships, can be an</w:t>
-      </w:r>
-    </w:p>
-    <w:p>
-      <w:r>
-        <w:t xml:space="preserve">effective way of presenting this information.  An </w:t>
-      </w:r>
-      <w:proofErr w:type="gramStart"/>
-      <w:r>
-        <w:t>example follows</w:t>
-      </w:r>
-      <w:proofErr w:type="gramEnd"/>
-      <w:r>
-        <w:t>:</w:t>
-      </w:r>
     </w:p>
     <w:p>
       <w:pPr>
@@ -6711,7 +6684,7 @@
         <w:rPr>
           <w:sz w:val="20"/>
         </w:rPr>
-        <w:t>Program</w:t>
+        <w:t>Project Team</w:t>
       </w:r>
     </w:p>
     <w:p>
@@ -6747,7 +6720,7 @@
         <w:rPr>
           <w:sz w:val="20"/>
         </w:rPr>
-        <w:t>Project Lead</w:t>
+        <w:t>Product Owner</w:t>
       </w:r>
     </w:p>
     <w:p/>
@@ -6781,161 +6754,280 @@
       </w:r>
       <w:bookmarkEnd w:id="70"/>
     </w:p>
-    <w:p/>
-    <w:p>
-      <w:r>
-        <w:t>[All those responsible for SCM implementation and performance should be described in this section.  A matrix describing SCM functions, activities, and tasks can be useful for documenting the SCM responsibilities.  For any review board or special organization established for performing SCM activities on this project, the Plan shall describe its</w:t>
-      </w:r>
-    </w:p>
-    <w:p>
-      <w:pPr>
-        <w:ind w:left="720"/>
-      </w:pPr>
-      <w:r>
-        <w:t xml:space="preserve">a) Purpose and </w:t>
-      </w:r>
-      <w:proofErr w:type="gramStart"/>
-      <w:r>
-        <w:t>objectives;</w:t>
-      </w:r>
-      <w:proofErr w:type="gramEnd"/>
-    </w:p>
-    <w:p>
-      <w:pPr>
-        <w:ind w:left="720"/>
-      </w:pPr>
-      <w:r>
-        <w:t xml:space="preserve">b) Membership and </w:t>
-      </w:r>
-      <w:proofErr w:type="gramStart"/>
-      <w:r>
-        <w:t>affiliations;</w:t>
-      </w:r>
-      <w:proofErr w:type="gramEnd"/>
-    </w:p>
-    <w:p>
-      <w:pPr>
-        <w:ind w:left="720"/>
-      </w:pPr>
-      <w:r>
-        <w:t xml:space="preserve">c) Period of </w:t>
-      </w:r>
-      <w:proofErr w:type="gramStart"/>
-      <w:r>
-        <w:t>effectivity;</w:t>
-      </w:r>
-      <w:proofErr w:type="gramEnd"/>
-    </w:p>
-    <w:p>
-      <w:pPr>
-        <w:ind w:left="720"/>
-      </w:pPr>
-      <w:r>
-        <w:t xml:space="preserve">d) Scope of </w:t>
-      </w:r>
-      <w:proofErr w:type="gramStart"/>
-      <w:r>
-        <w:t>authority;</w:t>
-      </w:r>
-      <w:proofErr w:type="gramEnd"/>
-    </w:p>
-    <w:p>
-      <w:pPr>
-        <w:ind w:left="720"/>
-      </w:pPr>
-      <w:r>
-        <w:t>e) Operational procedures.</w:t>
-      </w:r>
-    </w:p>
-    <w:p>
-      <w:pPr>
-        <w:ind w:left="720"/>
-      </w:pPr>
-    </w:p>
-    <w:p>
-      <w:r>
-        <w:t xml:space="preserve">The following provides an </w:t>
-      </w:r>
-      <w:proofErr w:type="gramStart"/>
-      <w:r>
-        <w:t>example</w:t>
-      </w:r>
-      <w:proofErr w:type="gramEnd"/>
-      <w:r>
-        <w:t xml:space="preserve"> </w:t>
-      </w:r>
-      <w:proofErr w:type="gramStart"/>
-      <w:r>
-        <w:t>typical responsibilities</w:t>
-      </w:r>
-      <w:proofErr w:type="gramEnd"/>
-      <w:r>
-        <w:t>:</w:t>
-      </w:r>
-    </w:p>
-    <w:p>
-      <w:r>
-        <w:t xml:space="preserve"> </w:t>
-      </w:r>
+    <w:p>
       <w:bookmarkStart w:id="73" w:name="_Toc329577248"/>
       <w:bookmarkStart w:id="74" w:name="_Toc340182583"/>
       <w:bookmarkStart w:id="75" w:name="_Toc340284260"/>
     </w:p>
-    <w:p>
-      <w:r>
-        <w:t>Program Manager</w:t>
-      </w:r>
-      <w:bookmarkEnd w:id="64"/>
-      <w:bookmarkEnd w:id="65"/>
-      <w:bookmarkEnd w:id="66"/>
-      <w:bookmarkEnd w:id="67"/>
-      <w:bookmarkEnd w:id="71"/>
-      <w:bookmarkEnd w:id="72"/>
-      <w:bookmarkEnd w:id="73"/>
-      <w:bookmarkEnd w:id="74"/>
-      <w:bookmarkEnd w:id="75"/>
-      <w:r>
-        <w:t xml:space="preserve">.  The Program Manager (PM) is responsible for ensuring the SCM process is developed, maintained and implemented.  The PM is responsible for ensuring that project leads and team members are adequately trained in SCM policy and procedure.  The [Project </w:t>
+    <w:bookmarkEnd w:id="64"/>
+    <w:bookmarkEnd w:id="65"/>
+    <w:bookmarkEnd w:id="66"/>
+    <w:bookmarkEnd w:id="67"/>
+    <w:bookmarkEnd w:id="71"/>
+    <w:bookmarkEnd w:id="72"/>
+    <w:bookmarkEnd w:id="73"/>
+    <w:bookmarkEnd w:id="74"/>
+    <w:bookmarkEnd w:id="75"/>
+    <w:p>
+      <w:r>
+        <w:t>Scrum Master</w:t>
+      </w:r>
+      <w:r>
+        <w:t xml:space="preserve">.  The </w:t>
+      </w:r>
+      <w:r>
+        <w:t>Scrum Master</w:t>
+      </w:r>
+      <w:r>
+        <w:t xml:space="preserve"> is responsible for ensuring the SCM process is developed, maintained and implemented.  The </w:t>
+      </w:r>
+      <w:r>
+        <w:t>Scrum Master</w:t>
+      </w:r>
+      <w:r>
+        <w:t xml:space="preserve"> is responsible for ensuring that </w:t>
+      </w:r>
+      <w:r>
+        <w:t>XP programmers and the Product Owner</w:t>
+      </w:r>
+      <w:r>
+        <w:t xml:space="preserve"> are adequately trained in SCM policy and procedure.  The </w:t>
+      </w:r>
+      <w:r>
+        <w:t>Data Warehouse Project</w:t>
+      </w:r>
+      <w:r>
+        <w:t xml:space="preserve"> </w:t>
+      </w:r>
+      <w:r>
+        <w:t>Scrum Master</w:t>
+      </w:r>
+      <w:r>
+        <w:t xml:space="preserve"> and </w:t>
+      </w:r>
+      <w:r>
+        <w:t>Product Owner</w:t>
+      </w:r>
+      <w:r>
+        <w:t xml:space="preserve"> work together to develop,  maintain, and implement effective software configuration management.  Please refer to Figure 3.1 and 3.1.</w:t>
+      </w:r>
+    </w:p>
+    <w:p/>
+    <w:p>
+      <w:r>
+        <w:t xml:space="preserve">The </w:t>
+      </w:r>
+      <w:r>
+        <w:t>Data Warehouse Team</w:t>
+      </w:r>
+      <w:r>
+        <w:t xml:space="preserve"> </w:t>
+      </w:r>
+      <w:r>
+        <w:t>Scrum Master</w:t>
+      </w:r>
+      <w:r>
+        <w:t xml:space="preserve"> has the authority to ensure development of an appropriate configuration management process.  Since CCB responsibility exists with the customer (See Figure 3.1), team </w:t>
       </w:r>
       <w:proofErr w:type="gramStart"/>
       <w:r>
-        <w:t>Abbreviation] Program</w:t>
+        <w:t>member(s)</w:t>
       </w:r>
       <w:proofErr w:type="gramEnd"/>
       <w:r>
-        <w:t xml:space="preserve"> Manager and Project Leads work together to develop,  maintain, and implement effective software configuration management.  Please refer to Figure 3.1 and 3.1.</w:t>
+        <w:t xml:space="preserve"> of the </w:t>
+      </w:r>
+      <w:r>
+        <w:t>Data Warehouse Team</w:t>
+      </w:r>
+      <w:r>
+        <w:t xml:space="preserve"> Project will be identified as members of this CCB and will represent our interests there.</w:t>
       </w:r>
     </w:p>
     <w:p/>
     <w:p>
       <w:r>
-        <w:t xml:space="preserve">The [Project Abbreviation] Program Manager (PM) has the authority to ensure development of an appropriate configuration management process.  Since CCB responsibility exists with the customer (See Figure 3.1), team </w:t>
-      </w:r>
-      <w:proofErr w:type="gramStart"/>
-      <w:r>
-        <w:t>member</w:t>
-      </w:r>
-      <w:proofErr w:type="gramEnd"/>
-      <w:r>
-        <w:t>(s) of the [Project Abbreviation] Project will be identified as members of this CCB and will represent our interests there.</w:t>
+        <w:t xml:space="preserve">The </w:t>
+      </w:r>
+      <w:r>
+        <w:t>Scrum Master</w:t>
+      </w:r>
+      <w:r>
+        <w:t xml:space="preserve"> is</w:t>
+      </w:r>
+      <w:r>
+        <w:t xml:space="preserve"> also</w:t>
+      </w:r>
+      <w:r>
+        <w:t xml:space="preserve"> responsible for implementing the actions of this process and for the implementation of </w:t>
+      </w:r>
+      <w:r>
+        <w:t>the client’s</w:t>
+      </w:r>
+      <w:r>
+        <w:t xml:space="preserve"> process improvement recommendations.  </w:t>
+      </w:r>
+    </w:p>
+    <w:p>
+      <w:r>
+        <w:t xml:space="preserve"> </w:t>
       </w:r>
     </w:p>
     <w:p/>
     <w:p>
-      <w:bookmarkStart w:id="76" w:name="_Toc301780468"/>
-      <w:bookmarkStart w:id="77" w:name="_Toc301780782"/>
-      <w:bookmarkStart w:id="78" w:name="_Toc301780841"/>
-      <w:bookmarkStart w:id="79" w:name="_Toc301781589"/>
-      <w:bookmarkStart w:id="80" w:name="_Toc316270559"/>
-      <w:bookmarkStart w:id="81" w:name="_Toc317663734"/>
-      <w:bookmarkStart w:id="82" w:name="_Toc329577249"/>
-      <w:bookmarkStart w:id="83" w:name="_Toc340182584"/>
-      <w:bookmarkStart w:id="84" w:name="_Toc340284261"/>
-      <w:r>
-        <w:t>Configuration Control Board</w:t>
+      <w:pPr>
+        <w:jc w:val="both"/>
+      </w:pPr>
+      <w:r>
+        <w:t xml:space="preserve">The </w:t>
+      </w:r>
+      <w:r>
+        <w:t>Scrum Master</w:t>
+      </w:r>
+      <w:r>
+        <w:t xml:space="preserve"> ensures that the process is implemented once approved and that proposed changes to the process are reviewed by</w:t>
+      </w:r>
+      <w:r>
+        <w:t xml:space="preserve"> the Data Warehouse Project</w:t>
+      </w:r>
+      <w:r>
+        <w:t xml:space="preserve"> team members and approved as required.</w:t>
+      </w:r>
+    </w:p>
+    <w:p/>
+    <w:p>
+      <w:r>
+        <w:t>The Scrum Master is</w:t>
+      </w:r>
+      <w:r>
+        <w:t xml:space="preserve"> responsible for adhering to the </w:t>
+      </w:r>
+      <w:r>
+        <w:t>Data Warehouse Project</w:t>
+      </w:r>
+      <w:r>
+        <w:t xml:space="preserve"> CM process and for ensuring that only approved changes are entered into the module product baselines.  </w:t>
+      </w:r>
+      <w:r>
+        <w:t>The Scrum Master is</w:t>
+      </w:r>
+      <w:r>
+        <w:t xml:space="preserve"> also responsible for identifying the module version to be included in the end-user products.  </w:t>
+      </w:r>
+      <w:r>
+        <w:t>The Scrum Master</w:t>
+      </w:r>
+      <w:r>
+        <w:t xml:space="preserve"> is responsible for controlling the software product(s) development and/or maintenance baseline to ensure that only approved changes are entered into the baseline(s) system.  The </w:t>
+      </w:r>
+      <w:r>
+        <w:t>Scrum Master</w:t>
+      </w:r>
+      <w:r>
+        <w:t xml:space="preserve"> maintains the software product with all changes to be approved by the associated CCB.</w:t>
+      </w:r>
+    </w:p>
+    <w:p/>
+    <w:p>
+      <w:r>
+        <w:lastRenderedPageBreak/>
+        <w:t xml:space="preserve">The </w:t>
+      </w:r>
+      <w:r>
+        <w:t>Scrum Master</w:t>
+      </w:r>
+      <w:r>
+        <w:t xml:space="preserve"> develops and proposes a baseline version of the software configuration management product, ensuring that the SCM process is followed, once approved, and proposes process changes to the </w:t>
+      </w:r>
+      <w:r>
+        <w:t>Data Warehouse Project</w:t>
+      </w:r>
+      <w:r>
+        <w:t xml:space="preserve"> SCM and CCB, as required.</w:t>
+      </w:r>
+    </w:p>
+    <w:p/>
+    <w:p>
+      <w:r>
+        <w:t>The Scrum Master</w:t>
+      </w:r>
+      <w:r>
+        <w:t xml:space="preserve"> is responsible for ensuring that project configuration management processes are followed.  The </w:t>
+      </w:r>
+      <w:r>
+        <w:t>Scrum Master</w:t>
+      </w:r>
+      <w:r>
+        <w:t xml:space="preserve"> also ensures all members of the project team are trained in SCM policies and procedures that apply to their function on the team.  This consists of initial training for new members and refresher training, as required, due to process or personnel changes.</w:t>
+      </w:r>
+    </w:p>
+    <w:p>
+      <w:pPr>
+        <w:pStyle w:val="Heading2"/>
+        <w:rPr>
+          <w:szCs w:val="24"/>
+        </w:rPr>
+      </w:pPr>
+      <w:bookmarkStart w:id="76" w:name="_Toc90707479"/>
+      <w:r>
+        <w:rPr>
+          <w:szCs w:val="24"/>
+        </w:rPr>
+        <w:t>Relationship of CM to the software process life cycle</w:t>
       </w:r>
       <w:bookmarkEnd w:id="76"/>
+    </w:p>
+    <w:p/>
+    <w:p>
+      <w:r>
+        <w:t>[This section should describe CM as it relates to other elements of the software process life cycle. ]</w:t>
+      </w:r>
+    </w:p>
+    <w:p>
+      <w:pPr>
+        <w:pStyle w:val="Heading2"/>
+      </w:pPr>
+      <w:bookmarkStart w:id="77" w:name="_Toc90707480"/>
+      <w:r>
+        <w:t>SCM Resources</w:t>
+      </w:r>
       <w:bookmarkEnd w:id="77"/>
+    </w:p>
+    <w:p>
+      <w:pPr>
+        <w:pStyle w:val="Index1"/>
+      </w:pPr>
+    </w:p>
+    <w:p>
+      <w:r>
+        <w:t>[This section should describe the minimum recommended resources (</w:t>
+      </w:r>
+      <w:proofErr w:type="spellStart"/>
+      <w:r>
+        <w:t>eg.</w:t>
+      </w:r>
+      <w:proofErr w:type="spellEnd"/>
+      <w:r>
+        <w:t>, time, tools, materials) dedicated to software configuration management activities.]</w:t>
+      </w:r>
+    </w:p>
+    <w:p>
+      <w:pPr>
+        <w:pStyle w:val="Heading1"/>
+      </w:pPr>
+      <w:bookmarkStart w:id="78" w:name="_Toc301780475"/>
+      <w:bookmarkStart w:id="79" w:name="_Toc301780789"/>
+      <w:bookmarkStart w:id="80" w:name="_Toc301780848"/>
+      <w:bookmarkStart w:id="81" w:name="_Toc301781596"/>
+      <w:bookmarkStart w:id="82" w:name="_Toc316270565"/>
+      <w:bookmarkStart w:id="83" w:name="_Toc317663740"/>
+      <w:bookmarkStart w:id="84" w:name="_Toc329577255"/>
+      <w:bookmarkStart w:id="85" w:name="_Toc340182589"/>
+      <w:bookmarkStart w:id="86" w:name="_Toc340284266"/>
+      <w:bookmarkStart w:id="87" w:name="_Toc90707481"/>
+      <w:r>
+        <w:t>SCM ACTIVITIES</w:t>
+      </w:r>
       <w:bookmarkEnd w:id="78"/>
       <w:bookmarkEnd w:id="79"/>
       <w:bookmarkEnd w:id="80"/>
@@ -6943,161 +7035,33 @@
       <w:bookmarkEnd w:id="82"/>
       <w:bookmarkEnd w:id="83"/>
       <w:bookmarkEnd w:id="84"/>
-      <w:r>
-        <w:t xml:space="preserve">.  The CCB is responsible for the review and approval of all Software Change Requests (SCRs), all baseline items, and all changes to baseline items.  The CCB considers the cost and impact of all proposed </w:t>
-      </w:r>
-      <w:proofErr w:type="gramStart"/>
-      <w:r>
-        <w:t>changes, and</w:t>
-      </w:r>
-      <w:proofErr w:type="gramEnd"/>
-      <w:r>
-        <w:t xml:space="preserve"> considers the impact </w:t>
-      </w:r>
-      <w:r>
-        <w:lastRenderedPageBreak/>
-        <w:t>to all interfacing items as part of their approval action.  The CCB for [Project Abbreviation] consists of the PM, the PL, and two or more members from the government Program Management team.</w:t>
-      </w:r>
-    </w:p>
-    <w:p>
-      <w:pPr>
-        <w:jc w:val="both"/>
-      </w:pPr>
-    </w:p>
-    <w:p>
-      <w:r>
-        <w:t xml:space="preserve">The associated Configuration Control Board (CCB) has the authority to approve a baseline version of this process, as well as any changes to the process as recommended by any associated CCB representative.  The same CCB has the authority to define the baseline for each software module, and end-user products, and to approve start of work and acceptance of completed changes to the baseline products.  This CCB also has the authority to approve reversion </w:t>
-      </w:r>
-      <w:proofErr w:type="gramStart"/>
-      <w:r>
-        <w:t>to</w:t>
-      </w:r>
-      <w:proofErr w:type="gramEnd"/>
-      <w:r>
-        <w:t xml:space="preserve"> a previous version of the product if warranted.   </w:t>
-      </w:r>
-    </w:p>
-    <w:p/>
-    <w:p>
-      <w:r>
-        <w:br w:type="page"/>
-      </w:r>
-      <w:r>
-        <w:lastRenderedPageBreak/>
-        <w:t xml:space="preserve">Software Configuration Manager.  The [Project Abbreviation] Program SCM is responsible for implementing the actions of this process and for the implementation of [Company Name] process improvement recommendations.  </w:t>
-      </w:r>
-    </w:p>
-    <w:p/>
-    <w:p>
-      <w:pPr>
-        <w:jc w:val="both"/>
-      </w:pPr>
-      <w:r>
-        <w:t>The Software Configuration Manager (SCM) ensures that the process is implemented once approved and that proposed changes to the process are reviewed by [Project Abbreviation] team members and approved by  the CCB as required.</w:t>
-      </w:r>
-    </w:p>
-    <w:p/>
-    <w:p>
-      <w:r>
-        <w:t xml:space="preserve">Project Lead.  Project Leads, or a </w:t>
-      </w:r>
-      <w:proofErr w:type="gramStart"/>
-      <w:r>
-        <w:t>designee</w:t>
-      </w:r>
-      <w:proofErr w:type="gramEnd"/>
-      <w:r>
-        <w:t xml:space="preserve">, are responsible for adhering to the [Project Abbreviation] CM process and for ensuring that only approved changes are entered into the module product baselines.  Project Leads, </w:t>
-      </w:r>
-      <w:proofErr w:type="gramStart"/>
-      <w:r>
-        <w:t>or a designee</w:t>
-      </w:r>
-      <w:proofErr w:type="gramEnd"/>
-      <w:r>
-        <w:t>, are also responsible for identifying the module version to be included in the end-user products.  The Project Lead, or a designee, is responsible for controlling the software product(s) development and/or maintenance baseline to ensure that only approved changes are entered into the baseline(s) system.  The Project Lead maintains the software product with all changes to be approved by the associated CCB.</w:t>
-      </w:r>
-    </w:p>
-    <w:p/>
-    <w:p>
-      <w:r>
-        <w:t>The Project Lead (PL) develops and proposes a baseline version of the software configuration management product, ensuring that the SCM process is followed, once approved, and proposes process changes to the [Project Abbreviation] SCM and CCB, as required.</w:t>
-      </w:r>
-    </w:p>
-    <w:p/>
-    <w:p>
-      <w:r>
-        <w:t>Each Project Lead (PL) is responsible for ensuring that project configuration management processes are followed.  The PL also ensures all members of the project team are trained in SCM policies and procedures that apply to their function on the team.  This consists of initial training for new members and refresher training, as required, due to process or personnel changes.]</w:t>
+      <w:bookmarkEnd w:id="85"/>
+      <w:bookmarkEnd w:id="86"/>
+      <w:bookmarkEnd w:id="87"/>
+      <w:r>
+        <w:t xml:space="preserve"> </w:t>
       </w:r>
     </w:p>
     <w:p>
       <w:pPr>
         <w:pStyle w:val="Heading2"/>
-        <w:rPr>
-          <w:szCs w:val="24"/>
-        </w:rPr>
-      </w:pPr>
-      <w:bookmarkStart w:id="85" w:name="_Toc90707479"/>
-      <w:r>
-        <w:rPr>
-          <w:szCs w:val="24"/>
-        </w:rPr>
-        <w:t>Relationship of CM to the software process life cycle</w:t>
-      </w:r>
-      <w:bookmarkEnd w:id="85"/>
-    </w:p>
-    <w:p/>
-    <w:p>
-      <w:r>
-        <w:t>[This section should describe CM as it relates to other elements of the software process life cycle. ]</w:t>
-      </w:r>
-    </w:p>
-    <w:p>
-      <w:pPr>
-        <w:pStyle w:val="Heading2"/>
-      </w:pPr>
-      <w:bookmarkStart w:id="86" w:name="_Toc90707480"/>
-      <w:r>
-        <w:t>SCM Resources</w:t>
-      </w:r>
-      <w:bookmarkEnd w:id="86"/>
-    </w:p>
-    <w:p>
-      <w:pPr>
-        <w:pStyle w:val="Index1"/>
-      </w:pPr>
-    </w:p>
-    <w:p>
-      <w:r>
-        <w:t>[This section should describe the minimum recommended resources (</w:t>
-      </w:r>
-      <w:proofErr w:type="spellStart"/>
-      <w:r>
-        <w:t>eg.</w:t>
-      </w:r>
-      <w:proofErr w:type="spellEnd"/>
-      <w:r>
-        <w:t>, time, tools, materials) dedicated to software configuration management activities.]</w:t>
-      </w:r>
-    </w:p>
-    <w:p>
-      <w:pPr>
-        <w:pStyle w:val="Heading1"/>
-      </w:pPr>
-      <w:bookmarkStart w:id="87" w:name="_Toc301780475"/>
-      <w:bookmarkStart w:id="88" w:name="_Toc301780789"/>
-      <w:bookmarkStart w:id="89" w:name="_Toc301780848"/>
-      <w:bookmarkStart w:id="90" w:name="_Toc301781596"/>
-      <w:bookmarkStart w:id="91" w:name="_Toc316270565"/>
-      <w:bookmarkStart w:id="92" w:name="_Toc317663740"/>
-      <w:bookmarkStart w:id="93" w:name="_Toc329577255"/>
-      <w:bookmarkStart w:id="94" w:name="_Toc340182589"/>
-      <w:bookmarkStart w:id="95" w:name="_Toc340284266"/>
-      <w:bookmarkStart w:id="96" w:name="_Toc90707481"/>
-      <w:r>
-        <w:t>SCM ACTIVITIES</w:t>
-      </w:r>
-      <w:bookmarkEnd w:id="87"/>
+      </w:pPr>
+      <w:bookmarkStart w:id="88" w:name="_Toc301780476"/>
+      <w:bookmarkStart w:id="89" w:name="_Toc301780790"/>
+      <w:bookmarkStart w:id="90" w:name="_Toc301780849"/>
+      <w:bookmarkStart w:id="91" w:name="_Toc301781597"/>
+      <w:bookmarkStart w:id="92" w:name="_Toc316270566"/>
+      <w:bookmarkStart w:id="93" w:name="_Toc317663741"/>
+      <w:r>
+        <w:t xml:space="preserve"> </w:t>
+      </w:r>
+      <w:bookmarkStart w:id="94" w:name="_Toc329577256"/>
+      <w:bookmarkStart w:id="95" w:name="_Toc340182590"/>
+      <w:bookmarkStart w:id="96" w:name="_Toc340284267"/>
+      <w:bookmarkStart w:id="97" w:name="_Toc90707482"/>
+      <w:r>
+        <w:t>Configuration Identification</w:t>
+      </w:r>
       <w:bookmarkEnd w:id="88"/>
       <w:bookmarkEnd w:id="89"/>
       <w:bookmarkEnd w:id="90"/>
@@ -7107,32 +7071,192 @@
       <w:bookmarkEnd w:id="94"/>
       <w:bookmarkEnd w:id="95"/>
       <w:bookmarkEnd w:id="96"/>
-      <w:r>
-        <w:t xml:space="preserve"> </w:t>
-      </w:r>
-    </w:p>
-    <w:p>
-      <w:pPr>
-        <w:pStyle w:val="Heading2"/>
-      </w:pPr>
-      <w:bookmarkStart w:id="97" w:name="_Toc301780476"/>
-      <w:bookmarkStart w:id="98" w:name="_Toc301780790"/>
-      <w:bookmarkStart w:id="99" w:name="_Toc301780849"/>
-      <w:bookmarkStart w:id="100" w:name="_Toc301781597"/>
-      <w:bookmarkStart w:id="101" w:name="_Toc316270566"/>
-      <w:bookmarkStart w:id="102" w:name="_Toc317663741"/>
-      <w:r>
-        <w:t xml:space="preserve"> </w:t>
-      </w:r>
-      <w:bookmarkStart w:id="103" w:name="_Toc329577256"/>
-      <w:bookmarkStart w:id="104" w:name="_Toc340182590"/>
-      <w:bookmarkStart w:id="105" w:name="_Toc340284267"/>
-      <w:bookmarkStart w:id="106" w:name="_Toc90707482"/>
-      <w:r>
-        <w:t>Configuration Identification</w:t>
-      </w:r>
       <w:bookmarkEnd w:id="97"/>
+    </w:p>
+    <w:p/>
+    <w:p>
+      <w:r>
+        <w:t xml:space="preserve">[All technical and managerial SCM activities should be described, as well as all functions and tasks required to manage the configuration of the software. General project activities that have SCM implications should also be described from the SCM perspective.  SCM activities are traditionally grouped into four functions: configuration identification, configuration control, status accounting, and configuration audits and reviews.  An example of the type of information provided in this section </w:t>
+      </w:r>
+      <w:proofErr w:type="gramStart"/>
+      <w:r>
+        <w:t>follows</w:t>
+      </w:r>
+      <w:proofErr w:type="gramEnd"/>
+      <w:r>
+        <w:t>:</w:t>
+      </w:r>
+    </w:p>
+    <w:p/>
+    <w:p>
+      <w:r>
+        <w:t xml:space="preserve">All [Project Abbreviation] Modules and baselines are to be approved by the CCB.  Once a module has been baselined all changes made will be identified in their respective Version Description Documents (VDDs).  </w:t>
+      </w:r>
+    </w:p>
+    <w:p>
+      <w:pPr>
+        <w:jc w:val="both"/>
+      </w:pPr>
+    </w:p>
+    <w:p>
+      <w:r>
+        <w:t>The [Project Abbreviation] is currently in development, product baseline to be approved upon delivery.</w:t>
+      </w:r>
+    </w:p>
+    <w:p>
+      <w:pPr>
+        <w:jc w:val="both"/>
+      </w:pPr>
+    </w:p>
+    <w:p>
+      <w:r>
+        <w:t xml:space="preserve">Product baselines are to be maintained by the [Project Abbreviation] SCM.  The Baseline will consist of the following:              </w:t>
+      </w:r>
+    </w:p>
+    <w:p/>
+    <w:p>
+      <w:pPr>
+        <w:numPr>
+          <w:ilvl w:val="0"/>
+          <w:numId w:val="2"/>
+        </w:numPr>
+      </w:pPr>
+      <w:r>
+        <w:t>source files</w:t>
+      </w:r>
+    </w:p>
+    <w:p>
+      <w:pPr>
+        <w:numPr>
+          <w:ilvl w:val="0"/>
+          <w:numId w:val="2"/>
+        </w:numPr>
+      </w:pPr>
+      <w:r>
+        <w:t>libraries</w:t>
+      </w:r>
+    </w:p>
+    <w:p>
+      <w:pPr>
+        <w:numPr>
+          <w:ilvl w:val="0"/>
+          <w:numId w:val="2"/>
+        </w:numPr>
+      </w:pPr>
+      <w:r>
+        <w:t xml:space="preserve">executable files </w:t>
+      </w:r>
+    </w:p>
+    <w:p>
+      <w:pPr>
+        <w:numPr>
+          <w:ilvl w:val="0"/>
+          <w:numId w:val="2"/>
+        </w:numPr>
+      </w:pPr>
+      <w:r>
+        <w:t>data files</w:t>
+      </w:r>
+    </w:p>
+    <w:p>
+      <w:pPr>
+        <w:numPr>
+          <w:ilvl w:val="0"/>
+          <w:numId w:val="2"/>
+        </w:numPr>
+      </w:pPr>
+      <w:proofErr w:type="spellStart"/>
+      <w:r>
+        <w:lastRenderedPageBreak/>
+        <w:t>makefiles</w:t>
+      </w:r>
+      <w:proofErr w:type="spellEnd"/>
+      <w:r>
+        <w:t xml:space="preserve">              </w:t>
+      </w:r>
+    </w:p>
+    <w:p>
+      <w:pPr>
+        <w:numPr>
+          <w:ilvl w:val="0"/>
+          <w:numId w:val="2"/>
+        </w:numPr>
+      </w:pPr>
+      <w:r>
+        <w:t xml:space="preserve">link files             </w:t>
+      </w:r>
+    </w:p>
+    <w:p>
+      <w:pPr>
+        <w:numPr>
+          <w:ilvl w:val="0"/>
+          <w:numId w:val="2"/>
+        </w:numPr>
+      </w:pPr>
+      <w:r>
+        <w:t>VDDs</w:t>
+      </w:r>
+    </w:p>
+    <w:p>
+      <w:pPr>
+        <w:numPr>
+          <w:ilvl w:val="0"/>
+          <w:numId w:val="2"/>
+        </w:numPr>
+      </w:pPr>
+      <w:r>
+        <w:t>User's Manuals</w:t>
+      </w:r>
+    </w:p>
+    <w:p>
+      <w:r>
+        <w:t>]</w:t>
+      </w:r>
+    </w:p>
+    <w:p/>
+    <w:p>
+      <w:pPr>
+        <w:pStyle w:val="Heading3"/>
+      </w:pPr>
+      <w:bookmarkStart w:id="98" w:name="_Toc90707483"/>
+      <w:bookmarkStart w:id="99" w:name="_Toc301780478"/>
+      <w:bookmarkStart w:id="100" w:name="_Toc301780792"/>
+      <w:bookmarkStart w:id="101" w:name="_Toc301780851"/>
+      <w:bookmarkStart w:id="102" w:name="_Toc301781599"/>
+      <w:bookmarkStart w:id="103" w:name="_Toc316270568"/>
+      <w:bookmarkStart w:id="104" w:name="_Toc317663743"/>
+      <w:bookmarkStart w:id="105" w:name="_Toc329577258"/>
+      <w:bookmarkStart w:id="106" w:name="_Toc340182592"/>
+      <w:bookmarkStart w:id="107" w:name="_Toc340284269"/>
+      <w:r>
+        <w:t>Specification Identification</w:t>
+      </w:r>
       <w:bookmarkEnd w:id="98"/>
+    </w:p>
+    <w:p>
+      <w:pPr>
+        <w:pStyle w:val="NormalIndent"/>
+      </w:pPr>
+    </w:p>
+    <w:p>
+      <w:r>
+        <w:t>[SCM activities should identify, name, and describe all code, specifications, design, and data elements to be controlled for the project. Controlled items may include executable</w:t>
+      </w:r>
+    </w:p>
+    <w:p>
+      <w:r>
+        <w:t>code, source code, user documentation, program listings, databases, test cases, test plans, specifications, management plans, and elements of the support environment (such as compilers, operating systems, programming tools, and test beds).]</w:t>
+      </w:r>
+    </w:p>
+    <w:p/>
+    <w:p>
+      <w:pPr>
+        <w:pStyle w:val="Heading3"/>
+      </w:pPr>
+      <w:bookmarkStart w:id="108" w:name="_Toc90707484"/>
+      <w:r>
+        <w:t>Change Control Form Identification</w:t>
+      </w:r>
       <w:bookmarkEnd w:id="99"/>
       <w:bookmarkEnd w:id="100"/>
       <w:bookmarkEnd w:id="101"/>
@@ -7141,197 +7265,242 @@
       <w:bookmarkEnd w:id="104"/>
       <w:bookmarkEnd w:id="105"/>
       <w:bookmarkEnd w:id="106"/>
+      <w:bookmarkEnd w:id="107"/>
+      <w:bookmarkEnd w:id="108"/>
+    </w:p>
+    <w:p>
+      <w:pPr>
+        <w:pStyle w:val="NormalIndent"/>
+      </w:pPr>
+    </w:p>
+    <w:p>
+      <w:r>
+        <w:t xml:space="preserve">The Plan should specify the procedures for requesting a change. As a minimum, the information recorded for a proposed change should contain the following: </w:t>
+      </w:r>
+    </w:p>
+    <w:p>
+      <w:pPr>
+        <w:ind w:left="720"/>
+      </w:pPr>
+      <w:r>
+        <w:t xml:space="preserve">a) The name(s) and version(s) of the CIs where the problem </w:t>
+      </w:r>
+      <w:proofErr w:type="gramStart"/>
+      <w:r>
+        <w:t>appears;</w:t>
+      </w:r>
+      <w:proofErr w:type="gramEnd"/>
+    </w:p>
+    <w:p>
+      <w:pPr>
+        <w:pStyle w:val="Index3"/>
+      </w:pPr>
+      <w:r>
+        <w:t xml:space="preserve">b) Originator’s name and </w:t>
+      </w:r>
+      <w:proofErr w:type="gramStart"/>
+      <w:r>
+        <w:t>organization;</w:t>
+      </w:r>
+      <w:proofErr w:type="gramEnd"/>
+    </w:p>
+    <w:p>
+      <w:pPr>
+        <w:ind w:left="720"/>
+      </w:pPr>
+      <w:r>
+        <w:t xml:space="preserve">c) Date of </w:t>
+      </w:r>
+      <w:proofErr w:type="gramStart"/>
+      <w:r>
+        <w:t>request;</w:t>
+      </w:r>
+      <w:proofErr w:type="gramEnd"/>
+    </w:p>
+    <w:p>
+      <w:pPr>
+        <w:ind w:left="720"/>
+      </w:pPr>
+      <w:r>
+        <w:t xml:space="preserve">d) Indication of </w:t>
+      </w:r>
+      <w:proofErr w:type="gramStart"/>
+      <w:r>
+        <w:t>urgency;</w:t>
+      </w:r>
+      <w:proofErr w:type="gramEnd"/>
+    </w:p>
+    <w:p>
+      <w:pPr>
+        <w:ind w:left="720"/>
+      </w:pPr>
+      <w:r>
+        <w:t xml:space="preserve">e) The need for the </w:t>
+      </w:r>
+      <w:proofErr w:type="gramStart"/>
+      <w:r>
+        <w:t>change;</w:t>
+      </w:r>
+      <w:proofErr w:type="gramEnd"/>
+    </w:p>
+    <w:p>
+      <w:pPr>
+        <w:ind w:left="720"/>
+      </w:pPr>
+      <w:r>
+        <w:t>f) Description of the requested change.</w:t>
+      </w:r>
+    </w:p>
+    <w:p>
+      <w:r>
+        <w:t xml:space="preserve">Additional information, such as priority or classification, may be included to assist in its analysis and evaluation. Other information, such as change request number, status, and disposition, may be recorded for change tracking.  An example of the type of information provided in this section </w:t>
+      </w:r>
+      <w:proofErr w:type="gramStart"/>
+      <w:r>
+        <w:t>follows</w:t>
+      </w:r>
+      <w:proofErr w:type="gramEnd"/>
+      <w:r>
+        <w:t>:</w:t>
+      </w:r>
     </w:p>
     <w:p/>
     <w:p>
       <w:r>
-        <w:t xml:space="preserve">[All technical and managerial SCM activities should be described, as well as all functions and tasks required to manage the configuration of the software. General project activities that have SCM implications should also be described from the SCM perspective.  SCM activities are traditionally grouped into four functions: configuration identification, </w:t>
-      </w:r>
+        <w:t xml:space="preserve">Software Change Request (SCR) procedures for each development team are defined in Appendix A.  These procedures  are used to add to, change, or remove items from the baselines.  The identification and tracking of change requests </w:t>
+      </w:r>
+      <w:proofErr w:type="gramStart"/>
+      <w:r>
+        <w:t>is</w:t>
+      </w:r>
+      <w:proofErr w:type="gramEnd"/>
+      <w:r>
+        <w:t xml:space="preserve"> accomplished through Change/Enhancement Requests (CER).  ]</w:t>
+      </w:r>
+    </w:p>
+    <w:p/>
+    <w:p>
+      <w:pPr>
+        <w:pStyle w:val="Heading3"/>
+      </w:pPr>
+      <w:bookmarkStart w:id="109" w:name="_Toc90707485"/>
+      <w:r>
+        <w:t>Project Baselines</w:t>
+      </w:r>
+      <w:bookmarkEnd w:id="109"/>
+    </w:p>
+    <w:p/>
+    <w:p>
+      <w:r>
+        <w:t xml:space="preserve">[This section should describe the configuration control activities required implement changes to baselined CIs. The Plan should define the following sequence of </w:t>
+      </w:r>
+      <w:proofErr w:type="spellStart"/>
+      <w:r>
+        <w:t>specifc</w:t>
+      </w:r>
+      <w:proofErr w:type="spellEnd"/>
+      <w:r>
+        <w:t xml:space="preserve"> steps:</w:t>
+      </w:r>
+    </w:p>
+    <w:p>
+      <w:pPr>
+        <w:ind w:left="720"/>
+      </w:pPr>
+      <w:r>
+        <w:t xml:space="preserve">a) Identification and documentation of the need for a </w:t>
+      </w:r>
+      <w:proofErr w:type="gramStart"/>
+      <w:r>
+        <w:t>change;</w:t>
+      </w:r>
+      <w:proofErr w:type="gramEnd"/>
+    </w:p>
+    <w:p>
+      <w:pPr>
+        <w:ind w:left="720"/>
+      </w:pPr>
+      <w:r>
+        <w:t xml:space="preserve">b) Analysis and evaluation of a change </w:t>
+      </w:r>
+      <w:proofErr w:type="gramStart"/>
+      <w:r>
+        <w:t>request;</w:t>
+      </w:r>
+      <w:proofErr w:type="gramEnd"/>
+    </w:p>
+    <w:p>
+      <w:pPr>
+        <w:ind w:left="720"/>
+      </w:pPr>
+      <w:r>
+        <w:t xml:space="preserve">c) Approval or disapproval of a </w:t>
+      </w:r>
+      <w:proofErr w:type="gramStart"/>
+      <w:r>
+        <w:t>request;</w:t>
+      </w:r>
+      <w:proofErr w:type="gramEnd"/>
+    </w:p>
+    <w:p>
+      <w:pPr>
+        <w:ind w:left="720"/>
+      </w:pPr>
+      <w:r>
+        <w:t>d) Verification, implementation, and release of a change.</w:t>
+      </w:r>
+    </w:p>
+    <w:p>
+      <w:r>
+        <w:t>The Plan should identify the records to be used for tracking and documenting this sequence of steps for each change.]</w:t>
+      </w:r>
+    </w:p>
+    <w:p>
+      <w:pPr>
+        <w:pStyle w:val="NormalIndent"/>
+      </w:pPr>
+    </w:p>
+    <w:p>
+      <w:pPr>
+        <w:pStyle w:val="Heading3"/>
+      </w:pPr>
+      <w:bookmarkStart w:id="110" w:name="_Toc90707486"/>
       <w:r>
         <w:lastRenderedPageBreak/>
-        <w:t xml:space="preserve">configuration control, status accounting, and configuration audits and reviews.  An example of the type of information provided in this section </w:t>
-      </w:r>
-      <w:proofErr w:type="gramStart"/>
-      <w:r>
-        <w:t>follows</w:t>
-      </w:r>
-      <w:proofErr w:type="gramEnd"/>
-      <w:r>
-        <w:t>:</w:t>
-      </w:r>
+        <w:t>Library</w:t>
+      </w:r>
+      <w:bookmarkEnd w:id="110"/>
     </w:p>
     <w:p/>
     <w:p>
       <w:r>
-        <w:t xml:space="preserve">All [Project Abbreviation] Modules and baselines are to be approved by the CCB.  Once a module has been baselined all changes made will be identified in their respective Version Description Documents (VDDs).  </w:t>
-      </w:r>
-    </w:p>
-    <w:p>
-      <w:pPr>
-        <w:jc w:val="both"/>
-      </w:pPr>
-    </w:p>
-    <w:p>
-      <w:r>
-        <w:t>The [Project Abbreviation] is currently in development, product baseline to be approved upon delivery.</w:t>
-      </w:r>
-    </w:p>
-    <w:p>
-      <w:pPr>
-        <w:jc w:val="both"/>
-      </w:pPr>
-    </w:p>
-    <w:p>
-      <w:r>
-        <w:t xml:space="preserve">Product baselines are to be maintained by the [Project Abbreviation] SCM.  The Baseline will consist of the following:              </w:t>
+        <w:t>[This section should identify the software configuration management repository, if one exists.  The following provides an example of the type of typical information:</w:t>
       </w:r>
     </w:p>
     <w:p/>
     <w:p>
-      <w:pPr>
-        <w:numPr>
-          <w:ilvl w:val="0"/>
-          <w:numId w:val="2"/>
-        </w:numPr>
-      </w:pPr>
-      <w:r>
-        <w:t>source files</w:t>
-      </w:r>
-    </w:p>
-    <w:p>
-      <w:pPr>
-        <w:numPr>
-          <w:ilvl w:val="0"/>
-          <w:numId w:val="2"/>
-        </w:numPr>
-      </w:pPr>
-      <w:r>
-        <w:t>libraries</w:t>
-      </w:r>
-    </w:p>
-    <w:p>
-      <w:pPr>
-        <w:numPr>
-          <w:ilvl w:val="0"/>
-          <w:numId w:val="2"/>
-        </w:numPr>
-      </w:pPr>
-      <w:r>
-        <w:t xml:space="preserve">executable files </w:t>
-      </w:r>
-    </w:p>
-    <w:p>
-      <w:pPr>
-        <w:numPr>
-          <w:ilvl w:val="0"/>
-          <w:numId w:val="2"/>
-        </w:numPr>
-      </w:pPr>
-      <w:r>
-        <w:t>data files</w:t>
-      </w:r>
-    </w:p>
-    <w:p>
-      <w:pPr>
-        <w:numPr>
-          <w:ilvl w:val="0"/>
-          <w:numId w:val="2"/>
-        </w:numPr>
-      </w:pPr>
-      <w:proofErr w:type="spellStart"/>
-      <w:r>
-        <w:t>makefiles</w:t>
-      </w:r>
-      <w:proofErr w:type="spellEnd"/>
-      <w:r>
-        <w:t xml:space="preserve">              </w:t>
-      </w:r>
-    </w:p>
-    <w:p>
-      <w:pPr>
-        <w:numPr>
-          <w:ilvl w:val="0"/>
-          <w:numId w:val="2"/>
-        </w:numPr>
-      </w:pPr>
-      <w:r>
-        <w:t xml:space="preserve">link files             </w:t>
-      </w:r>
-    </w:p>
-    <w:p>
-      <w:pPr>
-        <w:numPr>
-          <w:ilvl w:val="0"/>
-          <w:numId w:val="2"/>
-        </w:numPr>
-      </w:pPr>
-      <w:r>
-        <w:t>VDDs</w:t>
-      </w:r>
-    </w:p>
-    <w:p>
-      <w:pPr>
-        <w:numPr>
-          <w:ilvl w:val="0"/>
-          <w:numId w:val="2"/>
-        </w:numPr>
-      </w:pPr>
-      <w:r>
-        <w:t>User's Manuals</w:t>
-      </w:r>
-    </w:p>
-    <w:p>
-      <w:r>
-        <w:t>]</w:t>
+      <w:r>
+        <w:t xml:space="preserve">[Project Abbreviation] is composed of end-user products, module products and data.  The organization of these computer software units is given in Appendix C.]    </w:t>
       </w:r>
     </w:p>
     <w:p/>
     <w:p>
       <w:pPr>
-        <w:pStyle w:val="Heading3"/>
-      </w:pPr>
-      <w:bookmarkStart w:id="107" w:name="_Toc90707483"/>
-      <w:bookmarkStart w:id="108" w:name="_Toc301780478"/>
-      <w:bookmarkStart w:id="109" w:name="_Toc301780792"/>
-      <w:bookmarkStart w:id="110" w:name="_Toc301780851"/>
-      <w:bookmarkStart w:id="111" w:name="_Toc301781599"/>
-      <w:bookmarkStart w:id="112" w:name="_Toc316270568"/>
-      <w:bookmarkStart w:id="113" w:name="_Toc317663743"/>
-      <w:bookmarkStart w:id="114" w:name="_Toc329577258"/>
-      <w:bookmarkStart w:id="115" w:name="_Toc340182592"/>
-      <w:bookmarkStart w:id="116" w:name="_Toc340284269"/>
-      <w:r>
-        <w:t>Specification Identification</w:t>
-      </w:r>
-      <w:bookmarkEnd w:id="107"/>
-    </w:p>
-    <w:p>
-      <w:pPr>
-        <w:pStyle w:val="NormalIndent"/>
-      </w:pPr>
-    </w:p>
-    <w:p>
-      <w:r>
-        <w:t>[SCM activities should identify, name, and describe all code, specifications, design, and data elements to be controlled for the project. Controlled items may include executable</w:t>
-      </w:r>
-    </w:p>
-    <w:p>
-      <w:r>
-        <w:t>code, source code, user documentation, program listings, databases, test cases, test plans, specifications, management plans, and elements of the support environment (such as compilers, operating systems, programming tools, and test beds).]</w:t>
-      </w:r>
-    </w:p>
-    <w:p/>
-    <w:p>
-      <w:pPr>
-        <w:pStyle w:val="Heading3"/>
-      </w:pPr>
-      <w:bookmarkStart w:id="117" w:name="_Toc90707484"/>
-      <w:r>
-        <w:t>Change Control Form Identification</w:t>
-      </w:r>
-      <w:bookmarkEnd w:id="108"/>
-      <w:bookmarkEnd w:id="109"/>
-      <w:bookmarkEnd w:id="110"/>
+        <w:pStyle w:val="Heading2"/>
+      </w:pPr>
+      <w:bookmarkStart w:id="111" w:name="_Toc301780480"/>
+      <w:bookmarkStart w:id="112" w:name="_Toc301780794"/>
+      <w:bookmarkStart w:id="113" w:name="_Toc301780853"/>
+      <w:bookmarkStart w:id="114" w:name="_Toc301781601"/>
+      <w:bookmarkStart w:id="115" w:name="_Toc316270570"/>
+      <w:bookmarkStart w:id="116" w:name="_Toc317663745"/>
+      <w:bookmarkStart w:id="117" w:name="_Toc329577260"/>
+      <w:bookmarkStart w:id="118" w:name="_Toc340182594"/>
+      <w:bookmarkStart w:id="119" w:name="_Toc340284271"/>
+      <w:bookmarkStart w:id="120" w:name="_Toc90707487"/>
+      <w:r>
+        <w:t>Configuration Control</w:t>
+      </w:r>
       <w:bookmarkEnd w:id="111"/>
       <w:bookmarkEnd w:id="112"/>
       <w:bookmarkEnd w:id="113"/>
@@ -7339,115 +7508,144 @@
       <w:bookmarkEnd w:id="115"/>
       <w:bookmarkEnd w:id="116"/>
       <w:bookmarkEnd w:id="117"/>
-    </w:p>
-    <w:p>
-      <w:pPr>
-        <w:pStyle w:val="NormalIndent"/>
-      </w:pPr>
-    </w:p>
-    <w:p>
-      <w:r>
-        <w:t xml:space="preserve">The Plan should specify the procedures for requesting a change. As a minimum, the information recorded for a proposed change should contain the following: </w:t>
-      </w:r>
-    </w:p>
-    <w:p>
-      <w:pPr>
-        <w:ind w:left="720"/>
-      </w:pPr>
-      <w:r>
-        <w:t xml:space="preserve">a) The name(s) and version(s) of the CIs where the problem </w:t>
+      <w:bookmarkEnd w:id="118"/>
+      <w:bookmarkEnd w:id="119"/>
+      <w:bookmarkEnd w:id="120"/>
+      <w:r>
+        <w:t xml:space="preserve">  </w:t>
+      </w:r>
+    </w:p>
+    <w:p/>
+    <w:p>
+      <w:pPr>
+        <w:pStyle w:val="Heading3"/>
+      </w:pPr>
+      <w:bookmarkStart w:id="121" w:name="_Toc90707488"/>
+      <w:r>
+        <w:t>Procedures for changing baseline</w:t>
+      </w:r>
+      <w:bookmarkEnd w:id="121"/>
+    </w:p>
+    <w:p/>
+    <w:p>
+      <w:r>
+        <w:t xml:space="preserve">[This section should describe the procedures for making </w:t>
       </w:r>
       <w:proofErr w:type="gramStart"/>
       <w:r>
-        <w:t>appears;</w:t>
+        <w:t>controlled</w:t>
       </w:r>
       <w:proofErr w:type="gramEnd"/>
-    </w:p>
-    <w:p>
-      <w:pPr>
-        <w:pStyle w:val="Index3"/>
-      </w:pPr>
-      <w:r>
-        <w:t xml:space="preserve">b) Originator’s name and </w:t>
+      <w:r>
+        <w:t xml:space="preserve"> changes to the development baseline.  The following provides an example of this type of information:</w:t>
+      </w:r>
+    </w:p>
+    <w:p/>
+    <w:p>
+      <w:r>
+        <w:t>Changes to each software product baseline are made according to the change process.</w:t>
+      </w:r>
+    </w:p>
+    <w:p>
+      <w:r>
+        <w:t xml:space="preserve">    </w:t>
+      </w:r>
+    </w:p>
+    <w:p>
+      <w:r>
+        <w:t xml:space="preserve">Change Tracking. Changes to each software product baseline are tracked using an automated CER and SCR tracking system.  These systems report </w:t>
       </w:r>
       <w:proofErr w:type="gramStart"/>
       <w:r>
-        <w:t>organization;</w:t>
+        <w:t>current status</w:t>
       </w:r>
       <w:proofErr w:type="gramEnd"/>
-    </w:p>
-    <w:p>
-      <w:pPr>
-        <w:ind w:left="720"/>
-      </w:pPr>
-      <w:r>
-        <w:t xml:space="preserve">c) Date of </w:t>
-      </w:r>
-      <w:proofErr w:type="gramStart"/>
-      <w:r>
-        <w:t>request;</w:t>
-      </w:r>
-      <w:proofErr w:type="gramEnd"/>
-    </w:p>
-    <w:p>
-      <w:pPr>
-        <w:ind w:left="720"/>
-      </w:pPr>
-      <w:r>
-        <w:t xml:space="preserve">d) Indication of </w:t>
-      </w:r>
-      <w:proofErr w:type="gramStart"/>
-      <w:r>
-        <w:t>urgency;</w:t>
-      </w:r>
-      <w:proofErr w:type="gramEnd"/>
-    </w:p>
-    <w:p>
-      <w:pPr>
-        <w:ind w:left="720"/>
-      </w:pPr>
-      <w:r>
-        <w:t xml:space="preserve">e) The need for the </w:t>
-      </w:r>
-      <w:proofErr w:type="gramStart"/>
-      <w:r>
-        <w:t>change;</w:t>
-      </w:r>
-      <w:proofErr w:type="gramEnd"/>
-    </w:p>
-    <w:p>
-      <w:pPr>
-        <w:ind w:left="720"/>
-      </w:pPr>
-      <w:r>
-        <w:t>f) Description of the requested change.</w:t>
-      </w:r>
-    </w:p>
-    <w:p>
-      <w:r>
-        <w:t xml:space="preserve">Additional information, such as priority or classification, may be included to assist in its analysis and evaluation. Other information, such as change request number, status, and disposition, may be recorded for change tracking.  An example of the type of information provided in this section </w:t>
-      </w:r>
-      <w:proofErr w:type="gramStart"/>
-      <w:r>
-        <w:t>follows</w:t>
-      </w:r>
-      <w:proofErr w:type="gramEnd"/>
-      <w:r>
-        <w:t>:</w:t>
+      <w:r>
+        <w:t xml:space="preserve"> for all CERs and SCRs for a specified version and product.  </w:t>
+      </w:r>
+    </w:p>
+    <w:p>
+      <w:r>
+        <w:t xml:space="preserve">    </w:t>
+      </w:r>
+    </w:p>
+    <w:p>
+      <w:r>
+        <w:t>Change Release.  The PL provides reports containing the following information for review at each CCB meeting for:</w:t>
+      </w:r>
+    </w:p>
+    <w:p>
+      <w:pPr>
+        <w:jc w:val="both"/>
+      </w:pPr>
+      <w:r>
+        <w:t xml:space="preserve">                    </w:t>
+      </w:r>
+    </w:p>
+    <w:p>
+      <w:r>
+        <w:tab/>
+        <w:t>a)</w:t>
+      </w:r>
+      <w:r>
+        <w:tab/>
+        <w:t xml:space="preserve">Number of new CERs                  </w:t>
+      </w:r>
+    </w:p>
+    <w:p>
+      <w:r>
+        <w:tab/>
+        <w:t>b)</w:t>
+      </w:r>
+      <w:r>
+        <w:tab/>
+        <w:t xml:space="preserve">Type                  </w:t>
+      </w:r>
+    </w:p>
+    <w:p>
+      <w:r>
+        <w:tab/>
+        <w:t>c)</w:t>
+      </w:r>
+      <w:r>
+        <w:tab/>
+        <w:t xml:space="preserve">Priority                  </w:t>
+      </w:r>
+    </w:p>
+    <w:p>
+      <w:r>
+        <w:tab/>
+        <w:t>d)</w:t>
+      </w:r>
+      <w:r>
+        <w:tab/>
+        <w:t>Source (Internal, Field, FOT&amp;E)</w:t>
+      </w:r>
+    </w:p>
+    <w:p>
+      <w:r>
+        <w:tab/>
+        <w:t>e)</w:t>
+      </w:r>
+      <w:r>
+        <w:tab/>
+        <w:t xml:space="preserve">Action Required                  </w:t>
+      </w:r>
+    </w:p>
+    <w:p>
+      <w:r>
+        <w:tab/>
+        <w:t>f)</w:t>
+      </w:r>
+      <w:r>
+        <w:tab/>
+        <w:t>Number of CERs in each status</w:t>
       </w:r>
     </w:p>
     <w:p/>
     <w:p>
       <w:r>
-        <w:t xml:space="preserve">Software Change Request (SCR) procedures for each development team are defined in Appendix A.  These procedures  are used to add to, change, or remove items from the baselines.  The identification and tracking of change requests </w:t>
-      </w:r>
-      <w:proofErr w:type="gramStart"/>
-      <w:r>
-        <w:t>is</w:t>
-      </w:r>
-      <w:proofErr w:type="gramEnd"/>
-      <w:r>
-        <w:t xml:space="preserve"> accomplished through Change/Enhancement Requests (CER).  ]</w:t>
+        <w:t>Each development team Project Lead, or designated Change Request Coordinator (CRC), is responsible for keeping the information in the CER tracking system up to date so the information is available to the PL and PM prior to CCB meetings. ]</w:t>
       </w:r>
     </w:p>
     <w:p/>
@@ -7455,281 +7653,11 @@
       <w:pPr>
         <w:pStyle w:val="Heading3"/>
       </w:pPr>
-      <w:bookmarkStart w:id="118" w:name="_Toc90707485"/>
-      <w:r>
-        <w:t>Project Baselines</w:t>
-      </w:r>
-      <w:bookmarkEnd w:id="118"/>
-    </w:p>
-    <w:p/>
-    <w:p>
-      <w:r>
-        <w:t xml:space="preserve">[This section should describe the configuration control activities required implement changes to baselined CIs. The Plan should define the following sequence of </w:t>
-      </w:r>
-      <w:proofErr w:type="spellStart"/>
-      <w:r>
-        <w:t>specifc</w:t>
-      </w:r>
-      <w:proofErr w:type="spellEnd"/>
-      <w:r>
-        <w:t xml:space="preserve"> steps:</w:t>
-      </w:r>
-    </w:p>
-    <w:p>
-      <w:pPr>
-        <w:ind w:left="720"/>
-      </w:pPr>
-      <w:r>
-        <w:t xml:space="preserve">a) Identification and documentation of the need for a </w:t>
-      </w:r>
-      <w:proofErr w:type="gramStart"/>
-      <w:r>
-        <w:t>change;</w:t>
-      </w:r>
-      <w:proofErr w:type="gramEnd"/>
-    </w:p>
-    <w:p>
-      <w:pPr>
-        <w:ind w:left="720"/>
-      </w:pPr>
-      <w:r>
-        <w:t xml:space="preserve">b) Analysis and evaluation of a change </w:t>
-      </w:r>
-      <w:proofErr w:type="gramStart"/>
-      <w:r>
-        <w:t>request;</w:t>
-      </w:r>
-      <w:proofErr w:type="gramEnd"/>
-    </w:p>
-    <w:p>
-      <w:pPr>
-        <w:ind w:left="720"/>
-      </w:pPr>
-      <w:r>
-        <w:t xml:space="preserve">c) Approval or disapproval of a </w:t>
-      </w:r>
-      <w:proofErr w:type="gramStart"/>
-      <w:r>
-        <w:t>request;</w:t>
-      </w:r>
-      <w:proofErr w:type="gramEnd"/>
-    </w:p>
-    <w:p>
-      <w:pPr>
-        <w:ind w:left="720"/>
-      </w:pPr>
-      <w:r>
-        <w:t>d) Verification, implementation, and release of a change.</w:t>
-      </w:r>
-    </w:p>
-    <w:p>
-      <w:r>
-        <w:t>The Plan should identify the records to be used for tracking and documenting this sequence of steps for each change.]</w:t>
-      </w:r>
-    </w:p>
-    <w:p>
-      <w:pPr>
-        <w:pStyle w:val="NormalIndent"/>
-      </w:pPr>
-    </w:p>
-    <w:p>
-      <w:pPr>
-        <w:pStyle w:val="Heading3"/>
-      </w:pPr>
-      <w:bookmarkStart w:id="119" w:name="_Toc90707486"/>
-      <w:r>
-        <w:t>Library</w:t>
-      </w:r>
-      <w:bookmarkEnd w:id="119"/>
-    </w:p>
-    <w:p/>
-    <w:p>
-      <w:r>
-        <w:t>[This section should identify the software configuration management repository, if one exists.  The following provides an example of the type of typical information:</w:t>
-      </w:r>
-    </w:p>
-    <w:p/>
-    <w:p>
-      <w:r>
-        <w:t xml:space="preserve">[Project Abbreviation] is composed of end-user products, module products and data.  The organization of these computer software units is given in Appendix C.]    </w:t>
-      </w:r>
-    </w:p>
-    <w:p/>
-    <w:p>
-      <w:pPr>
-        <w:pStyle w:val="Heading2"/>
-      </w:pPr>
-      <w:bookmarkStart w:id="120" w:name="_Toc301780480"/>
-      <w:bookmarkStart w:id="121" w:name="_Toc301780794"/>
-      <w:bookmarkStart w:id="122" w:name="_Toc301780853"/>
-      <w:bookmarkStart w:id="123" w:name="_Toc301781601"/>
-      <w:bookmarkStart w:id="124" w:name="_Toc316270570"/>
-      <w:bookmarkStart w:id="125" w:name="_Toc317663745"/>
-      <w:bookmarkStart w:id="126" w:name="_Toc329577260"/>
-      <w:bookmarkStart w:id="127" w:name="_Toc340182594"/>
-      <w:bookmarkStart w:id="128" w:name="_Toc340284271"/>
-      <w:bookmarkStart w:id="129" w:name="_Toc90707487"/>
-      <w:r>
-        <w:t>Configuration Control</w:t>
-      </w:r>
-      <w:bookmarkEnd w:id="120"/>
-      <w:bookmarkEnd w:id="121"/>
+      <w:bookmarkStart w:id="122" w:name="_Toc90707489"/>
+      <w:r>
+        <w:t>Procedures for processing change requests and approvals</w:t>
+      </w:r>
       <w:bookmarkEnd w:id="122"/>
-      <w:bookmarkEnd w:id="123"/>
-      <w:bookmarkEnd w:id="124"/>
-      <w:bookmarkEnd w:id="125"/>
-      <w:bookmarkEnd w:id="126"/>
-      <w:bookmarkEnd w:id="127"/>
-      <w:bookmarkEnd w:id="128"/>
-      <w:bookmarkEnd w:id="129"/>
-      <w:r>
-        <w:t xml:space="preserve">  </w:t>
-      </w:r>
-    </w:p>
-    <w:p/>
-    <w:p>
-      <w:pPr>
-        <w:pStyle w:val="Heading3"/>
-      </w:pPr>
-      <w:bookmarkStart w:id="130" w:name="_Toc90707488"/>
-      <w:r>
-        <w:t>Procedures for changing baseline</w:t>
-      </w:r>
-      <w:bookmarkEnd w:id="130"/>
-    </w:p>
-    <w:p/>
-    <w:p>
-      <w:r>
-        <w:t xml:space="preserve">[This section should describe the procedures for making </w:t>
-      </w:r>
-      <w:proofErr w:type="gramStart"/>
-      <w:r>
-        <w:t>controlled</w:t>
-      </w:r>
-      <w:proofErr w:type="gramEnd"/>
-      <w:r>
-        <w:t xml:space="preserve"> changes to the development baseline.  The following provides an example of this type of information:</w:t>
-      </w:r>
-    </w:p>
-    <w:p/>
-    <w:p>
-      <w:r>
-        <w:t>Changes to each software product baseline are made according to the change process.</w:t>
-      </w:r>
-    </w:p>
-    <w:p>
-      <w:r>
-        <w:t xml:space="preserve">    </w:t>
-      </w:r>
-    </w:p>
-    <w:p>
-      <w:r>
-        <w:t xml:space="preserve">Change Tracking. Changes to each software product baseline are tracked using an automated CER and SCR tracking system.  These systems report </w:t>
-      </w:r>
-      <w:proofErr w:type="gramStart"/>
-      <w:r>
-        <w:t>current status</w:t>
-      </w:r>
-      <w:proofErr w:type="gramEnd"/>
-      <w:r>
-        <w:t xml:space="preserve"> for all CERs and SCRs for a specified version and product.  </w:t>
-      </w:r>
-    </w:p>
-    <w:p>
-      <w:r>
-        <w:t xml:space="preserve">    </w:t>
-      </w:r>
-    </w:p>
-    <w:p>
-      <w:r>
-        <w:t>Change Release.  The PL provides reports containing the following information for review at each CCB meeting for:</w:t>
-      </w:r>
-    </w:p>
-    <w:p>
-      <w:pPr>
-        <w:jc w:val="both"/>
-      </w:pPr>
-      <w:r>
-        <w:t xml:space="preserve">                    </w:t>
-      </w:r>
-    </w:p>
-    <w:p>
-      <w:r>
-        <w:tab/>
-        <w:t>a)</w:t>
-      </w:r>
-      <w:r>
-        <w:tab/>
-        <w:t xml:space="preserve">Number of new CERs                  </w:t>
-      </w:r>
-    </w:p>
-    <w:p>
-      <w:r>
-        <w:tab/>
-        <w:t>b)</w:t>
-      </w:r>
-      <w:r>
-        <w:tab/>
-        <w:t xml:space="preserve">Type                  </w:t>
-      </w:r>
-    </w:p>
-    <w:p>
-      <w:r>
-        <w:tab/>
-        <w:t>c)</w:t>
-      </w:r>
-      <w:r>
-        <w:tab/>
-        <w:t xml:space="preserve">Priority                  </w:t>
-      </w:r>
-    </w:p>
-    <w:p>
-      <w:r>
-        <w:tab/>
-        <w:t>d)</w:t>
-      </w:r>
-      <w:r>
-        <w:tab/>
-        <w:t>Source (Internal, Field, FOT&amp;E)</w:t>
-      </w:r>
-    </w:p>
-    <w:p>
-      <w:r>
-        <w:lastRenderedPageBreak/>
-        <w:tab/>
-        <w:t>e)</w:t>
-      </w:r>
-      <w:r>
-        <w:tab/>
-        <w:t xml:space="preserve">Action Required                  </w:t>
-      </w:r>
-    </w:p>
-    <w:p>
-      <w:r>
-        <w:tab/>
-        <w:t>f)</w:t>
-      </w:r>
-      <w:r>
-        <w:tab/>
-        <w:t>Number of CERs in each status</w:t>
-      </w:r>
-    </w:p>
-    <w:p/>
-    <w:p>
-      <w:r>
-        <w:t>Each development team Project Lead, or designated Change Request Coordinator (CRC), is responsible for keeping the information in the CER tracking system up to date so the information is available to the PL and PM prior to CCB meetings. ]</w:t>
-      </w:r>
-    </w:p>
-    <w:p/>
-    <w:p>
-      <w:pPr>
-        <w:pStyle w:val="Heading3"/>
-      </w:pPr>
-      <w:bookmarkStart w:id="131" w:name="_Toc90707489"/>
-      <w:r>
-        <w:t>Procedures for processing change requests and approvals</w:t>
-      </w:r>
-      <w:bookmarkEnd w:id="131"/>
     </w:p>
     <w:p/>
     <w:p>
@@ -8036,6 +7964,7 @@
           <w:noProof/>
           <w:sz w:val="20"/>
         </w:rPr>
+        <w:lastRenderedPageBreak/>
         <mc:AlternateContent>
           <mc:Choice Requires="wps">
             <w:drawing>
@@ -13562,112 +13491,139 @@
       <w:pPr>
         <w:pStyle w:val="Heading3"/>
       </w:pPr>
-      <w:bookmarkStart w:id="132" w:name="_Toc90707490"/>
+      <w:bookmarkStart w:id="123" w:name="_Toc90707490"/>
       <w:r>
         <w:t>Organizations assigned responsibilities for change control</w:t>
       </w:r>
+      <w:bookmarkEnd w:id="123"/>
+    </w:p>
+    <w:p>
+      <w:pPr>
+        <w:pStyle w:val="NormalIndent"/>
+      </w:pPr>
+    </w:p>
+    <w:p>
+      <w:r>
+        <w:t>[This section should describe all organizations associated with the change control process and their associated responsibilities.]</w:t>
+      </w:r>
+    </w:p>
+    <w:p/>
+    <w:p>
+      <w:pPr>
+        <w:pStyle w:val="Heading3"/>
+      </w:pPr>
+      <w:bookmarkStart w:id="124" w:name="_Toc90707491"/>
+      <w:r>
+        <w:t>Change Control Boards (CCBs)</w:t>
+      </w:r>
+      <w:bookmarkEnd w:id="124"/>
+      <w:r>
+        <w:t xml:space="preserve"> </w:t>
+      </w:r>
+    </w:p>
+    <w:p/>
+    <w:p>
+      <w:r>
+        <w:t>[This section should describe the role of the CCB and refer to any associated documentation (</w:t>
+      </w:r>
+      <w:proofErr w:type="spellStart"/>
+      <w:r>
+        <w:t>eg.</w:t>
+      </w:r>
+      <w:proofErr w:type="spellEnd"/>
+      <w:r>
+        <w:t>, CCB Charter).]</w:t>
+      </w:r>
+    </w:p>
+    <w:p/>
+    <w:p>
+      <w:pPr>
+        <w:pStyle w:val="Heading3"/>
+      </w:pPr>
+      <w:bookmarkStart w:id="125" w:name="_Toc90707492"/>
+      <w:r>
+        <w:t>Interfaces</w:t>
+      </w:r>
+      <w:bookmarkEnd w:id="125"/>
+      <w:r>
+        <w:br/>
+      </w:r>
+    </w:p>
+    <w:p>
+      <w:r>
+        <w:t>[This section should describe any required software interfaces and point to the source of their SCM documentation.]</w:t>
+      </w:r>
+    </w:p>
+    <w:p/>
+    <w:p>
+      <w:pPr>
+        <w:pStyle w:val="Heading3"/>
+      </w:pPr>
+      <w:bookmarkStart w:id="126" w:name="_Toc90707493"/>
+      <w:r>
+        <w:t>Level of control</w:t>
+      </w:r>
+      <w:bookmarkEnd w:id="126"/>
+    </w:p>
+    <w:p>
+      <w:r>
+        <w:t xml:space="preserve"> </w:t>
+      </w:r>
+    </w:p>
+    <w:p>
+      <w:bookmarkStart w:id="127" w:name="_Toc301780483"/>
+      <w:bookmarkStart w:id="128" w:name="_Toc301780797"/>
+      <w:bookmarkStart w:id="129" w:name="_Toc301780856"/>
+      <w:bookmarkStart w:id="130" w:name="_Toc301781604"/>
+      <w:bookmarkStart w:id="131" w:name="_Toc316270573"/>
+      <w:bookmarkStart w:id="132" w:name="_Toc317663748"/>
+      <w:bookmarkStart w:id="133" w:name="_Toc329577263"/>
+      <w:bookmarkStart w:id="134" w:name="_Toc340182597"/>
+      <w:bookmarkStart w:id="135" w:name="_Toc340284274"/>
+      <w:r>
+        <w:t xml:space="preserve">[This section should describe the levels of control and </w:t>
+      </w:r>
+      <w:proofErr w:type="gramStart"/>
+      <w:r>
+        <w:t>implementing</w:t>
+      </w:r>
+      <w:proofErr w:type="gramEnd"/>
+      <w:r>
+        <w:t xml:space="preserve"> authorities.  The following is an example:</w:t>
+      </w:r>
+    </w:p>
+    <w:p/>
+    <w:p>
+      <w:r>
+        <w:lastRenderedPageBreak/>
+        <w:t>Evaluating Changes</w:t>
+      </w:r>
+      <w:bookmarkEnd w:id="127"/>
+      <w:bookmarkEnd w:id="128"/>
+      <w:bookmarkEnd w:id="129"/>
+      <w:bookmarkEnd w:id="130"/>
+      <w:bookmarkEnd w:id="131"/>
       <w:bookmarkEnd w:id="132"/>
-    </w:p>
-    <w:p>
-      <w:pPr>
-        <w:pStyle w:val="NormalIndent"/>
-      </w:pPr>
-    </w:p>
-    <w:p>
-      <w:r>
-        <w:lastRenderedPageBreak/>
-        <w:t>[This section should describe all organizations associated with the change control process and their associated responsibilities.]</w:t>
+      <w:bookmarkEnd w:id="133"/>
+      <w:bookmarkEnd w:id="134"/>
+      <w:bookmarkEnd w:id="135"/>
+      <w:r>
+        <w:t>.  Changes to existing software baselines are evaluated by the software product’s associated CCB.</w:t>
       </w:r>
     </w:p>
     <w:p/>
     <w:p>
-      <w:pPr>
-        <w:pStyle w:val="Heading3"/>
-      </w:pPr>
-      <w:bookmarkStart w:id="133" w:name="_Toc90707491"/>
-      <w:r>
-        <w:t>Change Control Boards (CCBs)</w:t>
-      </w:r>
-      <w:bookmarkEnd w:id="133"/>
-      <w:r>
-        <w:t xml:space="preserve"> </w:t>
-      </w:r>
-    </w:p>
-    <w:p/>
-    <w:p>
-      <w:r>
-        <w:t>[This section should describe the role of the CCB and refer to any associated documentation (</w:t>
-      </w:r>
-      <w:proofErr w:type="spellStart"/>
-      <w:r>
-        <w:t>eg.</w:t>
-      </w:r>
-      <w:proofErr w:type="spellEnd"/>
-      <w:r>
-        <w:t>, CCB Charter).]</w:t>
-      </w:r>
-    </w:p>
-    <w:p/>
-    <w:p>
-      <w:pPr>
-        <w:pStyle w:val="Heading3"/>
-      </w:pPr>
-      <w:bookmarkStart w:id="134" w:name="_Toc90707492"/>
-      <w:r>
-        <w:t>Interfaces</w:t>
-      </w:r>
-      <w:bookmarkEnd w:id="134"/>
-      <w:r>
-        <w:br/>
-      </w:r>
-    </w:p>
-    <w:p>
-      <w:r>
-        <w:t>[This section should describe any required software interfaces and point to the source of their SCM documentation.]</w:t>
-      </w:r>
-    </w:p>
-    <w:p/>
-    <w:p>
-      <w:pPr>
-        <w:pStyle w:val="Heading3"/>
-      </w:pPr>
-      <w:bookmarkStart w:id="135" w:name="_Toc90707493"/>
-      <w:r>
-        <w:t>Level of control</w:t>
-      </w:r>
-      <w:bookmarkEnd w:id="135"/>
-    </w:p>
-    <w:p>
-      <w:r>
-        <w:t xml:space="preserve"> </w:t>
-      </w:r>
-    </w:p>
-    <w:p>
-      <w:bookmarkStart w:id="136" w:name="_Toc301780483"/>
-      <w:bookmarkStart w:id="137" w:name="_Toc301780797"/>
-      <w:bookmarkStart w:id="138" w:name="_Toc301780856"/>
-      <w:bookmarkStart w:id="139" w:name="_Toc301781604"/>
-      <w:bookmarkStart w:id="140" w:name="_Toc316270573"/>
-      <w:bookmarkStart w:id="141" w:name="_Toc317663748"/>
-      <w:bookmarkStart w:id="142" w:name="_Toc329577263"/>
-      <w:bookmarkStart w:id="143" w:name="_Toc340182597"/>
-      <w:bookmarkStart w:id="144" w:name="_Toc340284274"/>
-      <w:r>
-        <w:t xml:space="preserve">[This section should describe the levels of control and </w:t>
-      </w:r>
-      <w:proofErr w:type="gramStart"/>
-      <w:r>
-        <w:t>implementing</w:t>
-      </w:r>
-      <w:proofErr w:type="gramEnd"/>
-      <w:r>
-        <w:t xml:space="preserve"> authorities.  The following is an example:</w:t>
-      </w:r>
-    </w:p>
-    <w:p/>
-    <w:p>
-      <w:r>
-        <w:t>Evaluating Changes</w:t>
+      <w:bookmarkStart w:id="136" w:name="_Toc301780484"/>
+      <w:bookmarkStart w:id="137" w:name="_Toc301780798"/>
+      <w:bookmarkStart w:id="138" w:name="_Toc301780857"/>
+      <w:bookmarkStart w:id="139" w:name="_Toc301781605"/>
+      <w:bookmarkStart w:id="140" w:name="_Toc316270574"/>
+      <w:bookmarkStart w:id="141" w:name="_Toc317663749"/>
+      <w:bookmarkStart w:id="142" w:name="_Toc329577264"/>
+      <w:bookmarkStart w:id="143" w:name="_Toc340182598"/>
+      <w:bookmarkStart w:id="144" w:name="_Toc340284275"/>
+      <w:r>
+        <w:t>Approving or Disapproving Changes</w:t>
       </w:r>
       <w:bookmarkEnd w:id="136"/>
       <w:bookmarkEnd w:id="137"/>
@@ -13679,22 +13635,22 @@
       <w:bookmarkEnd w:id="143"/>
       <w:bookmarkEnd w:id="144"/>
       <w:r>
-        <w:t>.  Changes to existing software baselines are evaluated by the software product’s associated CCB.</w:t>
+        <w:t>.  Changes to existing software baselines are either approved or disapproved by the associated project CCB.</w:t>
       </w:r>
     </w:p>
     <w:p/>
     <w:p>
-      <w:bookmarkStart w:id="145" w:name="_Toc301780484"/>
-      <w:bookmarkStart w:id="146" w:name="_Toc301780798"/>
-      <w:bookmarkStart w:id="147" w:name="_Toc301780857"/>
-      <w:bookmarkStart w:id="148" w:name="_Toc301781605"/>
-      <w:bookmarkStart w:id="149" w:name="_Toc316270574"/>
-      <w:bookmarkStart w:id="150" w:name="_Toc317663749"/>
-      <w:bookmarkStart w:id="151" w:name="_Toc329577264"/>
-      <w:bookmarkStart w:id="152" w:name="_Toc340182598"/>
-      <w:bookmarkStart w:id="153" w:name="_Toc340284275"/>
-      <w:r>
-        <w:t>Approving or Disapproving Changes</w:t>
+      <w:bookmarkStart w:id="145" w:name="_Toc301780485"/>
+      <w:bookmarkStart w:id="146" w:name="_Toc301780799"/>
+      <w:bookmarkStart w:id="147" w:name="_Toc301780858"/>
+      <w:bookmarkStart w:id="148" w:name="_Toc301781606"/>
+      <w:bookmarkStart w:id="149" w:name="_Toc316270575"/>
+      <w:bookmarkStart w:id="150" w:name="_Toc317663750"/>
+      <w:bookmarkStart w:id="151" w:name="_Toc329577265"/>
+      <w:bookmarkStart w:id="152" w:name="_Toc340182599"/>
+      <w:bookmarkStart w:id="153" w:name="_Toc340284276"/>
+      <w:r>
+        <w:t>Implementing Changes</w:t>
       </w:r>
       <w:bookmarkEnd w:id="145"/>
       <w:bookmarkEnd w:id="146"/>
@@ -13706,25 +13662,128 @@
       <w:bookmarkEnd w:id="152"/>
       <w:bookmarkEnd w:id="153"/>
       <w:r>
-        <w:t>.  Changes to existing software baselines are either approved or disapproved by the associated project CCB.</w:t>
+        <w:t>.  Approved changes are incorporated into the product baseline by the development team as identified in Appendix A.]</w:t>
+      </w:r>
+    </w:p>
+    <w:p>
+      <w:pPr>
+        <w:pStyle w:val="NormalIndent"/>
+      </w:pPr>
+    </w:p>
+    <w:p>
+      <w:pPr>
+        <w:pStyle w:val="Heading3"/>
+      </w:pPr>
+      <w:bookmarkStart w:id="154" w:name="_Toc90707494"/>
+      <w:r>
+        <w:t>Document revisions</w:t>
+      </w:r>
+      <w:bookmarkEnd w:id="154"/>
+      <w:r>
+        <w:t xml:space="preserve"> </w:t>
       </w:r>
     </w:p>
     <w:p/>
     <w:p>
-      <w:bookmarkStart w:id="154" w:name="_Toc301780485"/>
-      <w:bookmarkStart w:id="155" w:name="_Toc301780799"/>
-      <w:bookmarkStart w:id="156" w:name="_Toc301780858"/>
-      <w:bookmarkStart w:id="157" w:name="_Toc301781606"/>
-      <w:bookmarkStart w:id="158" w:name="_Toc316270575"/>
-      <w:bookmarkStart w:id="159" w:name="_Toc317663750"/>
-      <w:bookmarkStart w:id="160" w:name="_Toc329577265"/>
-      <w:bookmarkStart w:id="161" w:name="_Toc340182599"/>
-      <w:bookmarkStart w:id="162" w:name="_Toc340284276"/>
-      <w:r>
-        <w:t>Implementing Changes</w:t>
-      </w:r>
-      <w:bookmarkEnd w:id="154"/>
+      <w:r>
+        <w:t>[This section should describe SCM plan maintenance information .  All activities and responsibilities necessary to ensure continued SCM planning during the life cycle of the project should be described. The Plan should describe:</w:t>
+      </w:r>
+    </w:p>
+    <w:p>
+      <w:pPr>
+        <w:ind w:left="720"/>
+      </w:pPr>
+      <w:r>
+        <w:t xml:space="preserve">a) Who is responsible for monitoring the </w:t>
+      </w:r>
+      <w:proofErr w:type="gramStart"/>
+      <w:r>
+        <w:t>Plan;</w:t>
+      </w:r>
+      <w:proofErr w:type="gramEnd"/>
+    </w:p>
+    <w:p>
+      <w:pPr>
+        <w:ind w:left="720"/>
+      </w:pPr>
+      <w:r>
+        <w:t xml:space="preserve">b) How </w:t>
+      </w:r>
+      <w:proofErr w:type="gramStart"/>
+      <w:r>
+        <w:t>frequently</w:t>
+      </w:r>
+      <w:proofErr w:type="gramEnd"/>
+      <w:r>
+        <w:t xml:space="preserve"> updates are to be </w:t>
+      </w:r>
+      <w:proofErr w:type="gramStart"/>
+      <w:r>
+        <w:t>performed;</w:t>
+      </w:r>
+      <w:proofErr w:type="gramEnd"/>
+    </w:p>
+    <w:p>
+      <w:pPr>
+        <w:ind w:left="720"/>
+      </w:pPr>
+      <w:r>
+        <w:t xml:space="preserve">c) How changes to the Plan are to be evaluated and </w:t>
+      </w:r>
+      <w:proofErr w:type="gramStart"/>
+      <w:r>
+        <w:t>approved;</w:t>
+      </w:r>
+      <w:proofErr w:type="gramEnd"/>
+    </w:p>
+    <w:p>
+      <w:pPr>
+        <w:ind w:left="720"/>
+      </w:pPr>
+      <w:r>
+        <w:t>d) How changes to the Plan are to be made and communicated.]</w:t>
+      </w:r>
+    </w:p>
+    <w:p/>
+    <w:p>
+      <w:pPr>
+        <w:pStyle w:val="Heading3"/>
+      </w:pPr>
+      <w:bookmarkStart w:id="155" w:name="_Toc90707495"/>
+      <w:r>
+        <w:t>Automated tools used to perform change control</w:t>
+      </w:r>
       <w:bookmarkEnd w:id="155"/>
+    </w:p>
+    <w:p/>
+    <w:p>
+      <w:r>
+        <w:t>[This section should identify all software tools, techniques, equipment, personnel, and training necessary for the implementation of SCM activities.  SCM can be performed by a combination of software tools and manual procedures. For each software tool, whether developed within the project or brought in from outside the project, the Plan should</w:t>
+      </w:r>
+    </w:p>
+    <w:p>
+      <w:r>
+        <w:t>describe or reference its functions and shall identify all configuration controls to be placed on the tool.]</w:t>
+      </w:r>
+    </w:p>
+    <w:p/>
+    <w:p>
+      <w:pPr>
+        <w:pStyle w:val="Heading2"/>
+      </w:pPr>
+      <w:bookmarkStart w:id="156" w:name="_Toc301780487"/>
+      <w:bookmarkStart w:id="157" w:name="_Toc301780801"/>
+      <w:bookmarkStart w:id="158" w:name="_Toc301780860"/>
+      <w:bookmarkStart w:id="159" w:name="_Toc301781608"/>
+      <w:bookmarkStart w:id="160" w:name="_Toc316270577"/>
+      <w:bookmarkStart w:id="161" w:name="_Toc317663752"/>
+      <w:bookmarkStart w:id="162" w:name="_Toc329577267"/>
+      <w:bookmarkStart w:id="163" w:name="_Toc340182601"/>
+      <w:bookmarkStart w:id="164" w:name="_Toc340284278"/>
+      <w:bookmarkStart w:id="165" w:name="_Toc90707496"/>
+      <w:r>
+        <w:t>Configuration Status Accounting</w:t>
+      </w:r>
       <w:bookmarkEnd w:id="156"/>
       <w:bookmarkEnd w:id="157"/>
       <w:bookmarkEnd w:id="158"/>
@@ -13732,130 +13791,69 @@
       <w:bookmarkEnd w:id="160"/>
       <w:bookmarkEnd w:id="161"/>
       <w:bookmarkEnd w:id="162"/>
-      <w:r>
-        <w:t>.  Approved changes are incorporated into the product baseline by the development team as identified in Appendix A.]</w:t>
-      </w:r>
-    </w:p>
-    <w:p>
-      <w:pPr>
-        <w:pStyle w:val="NormalIndent"/>
+      <w:bookmarkEnd w:id="163"/>
+      <w:bookmarkEnd w:id="164"/>
+      <w:bookmarkEnd w:id="165"/>
+    </w:p>
+    <w:p/>
+    <w:p>
+      <w:r>
+        <w:t>[Configuration status accounting activities record and report the status of a project’s CIs.</w:t>
+      </w:r>
+    </w:p>
+    <w:p>
+      <w:pPr>
+        <w:rPr>
+          <w:rFonts w:ascii="Helvetica+2" w:hAnsi="Helvetica+2"/>
+          <w:sz w:val="16"/>
+          <w:szCs w:val="16"/>
+        </w:rPr>
+      </w:pPr>
+      <w:r>
+        <w:t>The SCM plan should describe what will be tracked and reported, describe the types of reporting and its frequency, and how the information will be processed and controlled.</w:t>
+      </w:r>
+    </w:p>
+    <w:p>
+      <w:r>
+        <w:t xml:space="preserve"> </w:t>
+      </w:r>
+    </w:p>
+    <w:p>
+      <w:r>
+        <w:t>If an automated system is used for any status accounting activity, its function should be described or referenced. The following minimum data elements shall be tracked and reported for each CI: its initial approved version, the status of requested changes, and the implementation status of approved changes. The level of detail and specific data required</w:t>
+      </w:r>
+    </w:p>
+    <w:p>
+      <w:r>
+        <w:t>may vary according to the information needs of the project and the customer.  ]</w:t>
+      </w:r>
+    </w:p>
+    <w:p>
+      <w:pPr>
+        <w:rPr>
+          <w:rFonts w:ascii="Helvetica-Bold+2" w:hAnsi="Helvetica-Bold+2"/>
+          <w:b/>
+          <w:bCs/>
+        </w:rPr>
       </w:pPr>
     </w:p>
     <w:p>
       <w:pPr>
         <w:pStyle w:val="Heading3"/>
       </w:pPr>
-      <w:bookmarkStart w:id="163" w:name="_Toc90707494"/>
-      <w:r>
-        <w:t>Document revisions</w:t>
-      </w:r>
-      <w:bookmarkEnd w:id="163"/>
-      <w:r>
-        <w:t xml:space="preserve"> </w:t>
-      </w:r>
-    </w:p>
-    <w:p/>
-    <w:p>
-      <w:r>
-        <w:t>[This section should describe SCM plan maintenance information .  All activities and responsibilities necessary to ensure continued SCM planning during the life cycle of the project should be described. The Plan should describe:</w:t>
-      </w:r>
-    </w:p>
-    <w:p>
-      <w:pPr>
-        <w:ind w:left="720"/>
-      </w:pPr>
-      <w:r>
-        <w:t xml:space="preserve">a) Who is responsible for monitoring the </w:t>
-      </w:r>
-      <w:proofErr w:type="gramStart"/>
-      <w:r>
-        <w:t>Plan;</w:t>
-      </w:r>
-      <w:proofErr w:type="gramEnd"/>
-    </w:p>
-    <w:p>
-      <w:pPr>
-        <w:ind w:left="720"/>
-      </w:pPr>
-      <w:r>
-        <w:t xml:space="preserve">b) How </w:t>
-      </w:r>
-      <w:proofErr w:type="gramStart"/>
-      <w:r>
-        <w:t>frequently</w:t>
-      </w:r>
-      <w:proofErr w:type="gramEnd"/>
-      <w:r>
-        <w:t xml:space="preserve"> updates are to be </w:t>
-      </w:r>
-      <w:proofErr w:type="gramStart"/>
-      <w:r>
-        <w:t>performed;</w:t>
-      </w:r>
-      <w:proofErr w:type="gramEnd"/>
-    </w:p>
-    <w:p>
-      <w:pPr>
-        <w:ind w:left="720"/>
-      </w:pPr>
-      <w:r>
-        <w:t xml:space="preserve">c) How changes to the Plan are to be evaluated and </w:t>
-      </w:r>
-      <w:proofErr w:type="gramStart"/>
-      <w:r>
-        <w:t>approved;</w:t>
-      </w:r>
-      <w:proofErr w:type="gramEnd"/>
-    </w:p>
-    <w:p>
-      <w:pPr>
-        <w:ind w:left="720"/>
-      </w:pPr>
-      <w:r>
-        <w:t>d) How changes to the Plan are to be made and communicated.]</w:t>
-      </w:r>
-    </w:p>
-    <w:p/>
-    <w:p>
-      <w:pPr>
-        <w:pStyle w:val="Heading3"/>
-      </w:pPr>
-      <w:bookmarkStart w:id="164" w:name="_Toc90707495"/>
-      <w:r>
-        <w:t>Automated tools used to perform change control</w:t>
-      </w:r>
-      <w:bookmarkEnd w:id="164"/>
-    </w:p>
-    <w:p/>
-    <w:p>
-      <w:r>
-        <w:t>[This section should identify all software tools, techniques, equipment, personnel, and training necessary for the implementation of SCM activities.  SCM can be performed by a combination of software tools and manual procedures. For each software tool, whether developed within the project or brought in from outside the project, the Plan should</w:t>
-      </w:r>
-    </w:p>
-    <w:p>
-      <w:r>
-        <w:t>describe or reference its functions and shall identify all configuration controls to be placed on the tool.]</w:t>
-      </w:r>
-    </w:p>
-    <w:p/>
-    <w:p>
-      <w:pPr>
-        <w:pStyle w:val="Heading2"/>
-      </w:pPr>
-      <w:bookmarkStart w:id="165" w:name="_Toc301780487"/>
-      <w:bookmarkStart w:id="166" w:name="_Toc301780801"/>
-      <w:bookmarkStart w:id="167" w:name="_Toc301780860"/>
-      <w:bookmarkStart w:id="168" w:name="_Toc301781608"/>
-      <w:bookmarkStart w:id="169" w:name="_Toc316270577"/>
-      <w:bookmarkStart w:id="170" w:name="_Toc317663752"/>
-      <w:bookmarkStart w:id="171" w:name="_Toc329577267"/>
-      <w:bookmarkStart w:id="172" w:name="_Toc340182601"/>
-      <w:bookmarkStart w:id="173" w:name="_Toc340284278"/>
-      <w:bookmarkStart w:id="174" w:name="_Toc90707496"/>
-      <w:r>
-        <w:t>Configuration Status Accounting</w:t>
-      </w:r>
-      <w:bookmarkEnd w:id="165"/>
+      <w:bookmarkStart w:id="166" w:name="_Toc301780488"/>
+      <w:bookmarkStart w:id="167" w:name="_Toc301780802"/>
+      <w:bookmarkStart w:id="168" w:name="_Toc301780861"/>
+      <w:bookmarkStart w:id="169" w:name="_Toc301781609"/>
+      <w:bookmarkStart w:id="170" w:name="_Toc316270578"/>
+      <w:bookmarkStart w:id="171" w:name="_Toc317663753"/>
+      <w:bookmarkStart w:id="172" w:name="_Toc329577268"/>
+      <w:bookmarkStart w:id="173" w:name="_Toc340182602"/>
+      <w:bookmarkStart w:id="174" w:name="_Toc340284279"/>
+      <w:bookmarkStart w:id="175" w:name="_Toc90707497"/>
+      <w:r>
+        <w:t>Storage, handling and release of project media</w:t>
+      </w:r>
       <w:bookmarkEnd w:id="166"/>
       <w:bookmarkEnd w:id="167"/>
       <w:bookmarkEnd w:id="168"/>
@@ -13865,354 +13863,341 @@
       <w:bookmarkEnd w:id="172"/>
       <w:bookmarkEnd w:id="173"/>
       <w:bookmarkEnd w:id="174"/>
-    </w:p>
-    <w:p/>
-    <w:p>
-      <w:r>
-        <w:t>[Configuration status accounting activities record and report the status of a project’s CIs.</w:t>
-      </w:r>
-    </w:p>
-    <w:p>
-      <w:pPr>
-        <w:rPr>
-          <w:rFonts w:ascii="Helvetica+2" w:hAnsi="Helvetica+2"/>
-          <w:sz w:val="16"/>
-          <w:szCs w:val="16"/>
-        </w:rPr>
-      </w:pPr>
-      <w:r>
-        <w:t>The SCM plan should describe what will be tracked and reported, describe the types of reporting and its frequency, and how the information will be processed and controlled.</w:t>
-      </w:r>
+      <w:bookmarkEnd w:id="175"/>
+    </w:p>
+    <w:p>
+      <w:pPr>
+        <w:pStyle w:val="NormalIndent"/>
+        <w:ind w:left="0"/>
+      </w:pPr>
+    </w:p>
+    <w:p>
+      <w:pPr>
+        <w:pStyle w:val="NormalIndent"/>
+        <w:ind w:left="0"/>
+      </w:pPr>
+      <w:r>
+        <w:t>[This section should describe the storage, handling and release of SCM products.  The following is provided as an example:</w:t>
+      </w:r>
+    </w:p>
+    <w:p>
+      <w:pPr>
+        <w:pStyle w:val="NormalIndent"/>
+        <w:ind w:left="0"/>
+      </w:pPr>
+    </w:p>
+    <w:p>
+      <w:r>
+        <w:lastRenderedPageBreak/>
+        <w:t>The initial approved version of any [Project Abbreviation] software product is separately maintained by the PL until the approval of subsequent version of the product. Upon approval of the subsequent version the initial version is held in the project SCM library.  This library is under configuration control.]</w:t>
+      </w:r>
+    </w:p>
+    <w:p>
+      <w:r>
+        <w:tab/>
+      </w:r>
+    </w:p>
+    <w:p>
+      <w:pPr>
+        <w:pStyle w:val="Heading3"/>
+      </w:pPr>
+      <w:bookmarkStart w:id="176" w:name="_Toc90707498"/>
+      <w:bookmarkStart w:id="177" w:name="_Toc301780489"/>
+      <w:bookmarkStart w:id="178" w:name="_Toc301780803"/>
+      <w:bookmarkStart w:id="179" w:name="_Toc301780862"/>
+      <w:bookmarkStart w:id="180" w:name="_Toc301781610"/>
+      <w:bookmarkStart w:id="181" w:name="_Toc316270579"/>
+      <w:bookmarkStart w:id="182" w:name="_Toc317663754"/>
+      <w:r>
+        <w:t>Information and Control</w:t>
+      </w:r>
+      <w:bookmarkEnd w:id="176"/>
     </w:p>
     <w:p>
       <w:r>
         <w:t xml:space="preserve"> </w:t>
       </w:r>
-    </w:p>
-    <w:p>
-      <w:r>
-        <w:t>If an automated system is used for any status accounting activity, its function should be described or referenced. The following minimum data elements shall be tracked and reported for each CI: its initial approved version, the status of requested changes, and the implementation status of approved changes. The level of detail and specific data required</w:t>
-      </w:r>
-    </w:p>
-    <w:p>
-      <w:r>
-        <w:t>may vary according to the information needs of the project and the customer.  ]</w:t>
-      </w:r>
-    </w:p>
-    <w:p>
-      <w:pPr>
-        <w:rPr>
-          <w:rFonts w:ascii="Helvetica-Bold+2" w:hAnsi="Helvetica-Bold+2"/>
-          <w:b/>
-          <w:bCs/>
-        </w:rPr>
-      </w:pPr>
-    </w:p>
-    <w:p>
-      <w:pPr>
-        <w:pStyle w:val="Heading3"/>
-      </w:pPr>
-      <w:bookmarkStart w:id="175" w:name="_Toc301780488"/>
-      <w:bookmarkStart w:id="176" w:name="_Toc301780802"/>
-      <w:bookmarkStart w:id="177" w:name="_Toc301780861"/>
-      <w:bookmarkStart w:id="178" w:name="_Toc301781609"/>
-      <w:bookmarkStart w:id="179" w:name="_Toc316270578"/>
-      <w:bookmarkStart w:id="180" w:name="_Toc317663753"/>
-      <w:bookmarkStart w:id="181" w:name="_Toc329577268"/>
-      <w:bookmarkStart w:id="182" w:name="_Toc340182602"/>
-      <w:bookmarkStart w:id="183" w:name="_Toc340284279"/>
-      <w:bookmarkStart w:id="184" w:name="_Toc90707497"/>
-      <w:r>
-        <w:t>Storage, handling and release of project media</w:t>
-      </w:r>
-      <w:bookmarkEnd w:id="175"/>
-      <w:bookmarkEnd w:id="176"/>
       <w:bookmarkEnd w:id="177"/>
       <w:bookmarkEnd w:id="178"/>
       <w:bookmarkEnd w:id="179"/>
       <w:bookmarkEnd w:id="180"/>
       <w:bookmarkEnd w:id="181"/>
       <w:bookmarkEnd w:id="182"/>
+    </w:p>
+    <w:p>
+      <w:pPr>
+        <w:pStyle w:val="Heading3"/>
+      </w:pPr>
+      <w:bookmarkStart w:id="183" w:name="_Toc90707499"/>
+      <w:r>
+        <w:t>Reporting</w:t>
+      </w:r>
       <w:bookmarkEnd w:id="183"/>
+    </w:p>
+    <w:p/>
+    <w:p>
+      <w:r>
+        <w:t xml:space="preserve">[This section should describe the format, frequency, and process for reporting SCM product baseline status.  Providing Configuration Items </w:t>
+      </w:r>
+      <w:proofErr w:type="gramStart"/>
+      <w:r>
+        <w:t>to</w:t>
+      </w:r>
+      <w:proofErr w:type="gramEnd"/>
+      <w:r>
+        <w:t xml:space="preserve"> testing may require a Test Item Transmittal Report.  This Test Item report should identify the person responsible for each item, the physical location of the item, and item status. The following is an example of status report of requested changes:</w:t>
+      </w:r>
+    </w:p>
+    <w:p/>
+    <w:p>
+      <w:r>
+        <w:t xml:space="preserve">The status report of requested changes is available to the PM at any time.  A schedule status report may be provided to the CCB weekly and reported to [Company Name] senior management </w:t>
+      </w:r>
+      <w:proofErr w:type="gramStart"/>
+      <w:r>
+        <w:t>on a monthly basis</w:t>
+      </w:r>
+      <w:proofErr w:type="gramEnd"/>
+      <w:r>
+        <w:t>.  Please refer to the [Project Abbreviation] Software Development Plan, Section 6, for a status report schedule example.]</w:t>
+      </w:r>
+    </w:p>
+    <w:p/>
+    <w:p>
+      <w:pPr>
+        <w:pStyle w:val="Heading3"/>
+      </w:pPr>
+      <w:bookmarkStart w:id="184" w:name="_Toc90707500"/>
+      <w:r>
+        <w:t>Release process</w:t>
+      </w:r>
       <w:bookmarkEnd w:id="184"/>
     </w:p>
-    <w:p>
-      <w:pPr>
-        <w:pStyle w:val="NormalIndent"/>
-        <w:ind w:left="0"/>
-      </w:pPr>
-    </w:p>
-    <w:p>
-      <w:pPr>
-        <w:pStyle w:val="NormalIndent"/>
-        <w:ind w:left="0"/>
-      </w:pPr>
-      <w:r>
-        <w:t>[This section should describe the storage, handling and release of SCM products.  The following is provided as an example:</w:t>
-      </w:r>
-    </w:p>
-    <w:p>
-      <w:pPr>
-        <w:pStyle w:val="NormalIndent"/>
-        <w:ind w:left="0"/>
-      </w:pPr>
-    </w:p>
-    <w:p>
-      <w:r>
-        <w:t>The initial approved version of any [Project Abbreviation] software product is separately maintained by the PL until the approval of subsequent version of the product. Upon approval of the subsequent version the initial version is held in the project SCM library.  This library is under configuration control.]</w:t>
-      </w:r>
-    </w:p>
-    <w:p>
-      <w:r>
-        <w:tab/>
-      </w:r>
-    </w:p>
+    <w:p/>
+    <w:p>
+      <w:r>
+        <w:t>[This section should describe the release process, including all required approvals.  A summary chart is sometimes used to describe the release process effectively.]</w:t>
+      </w:r>
+    </w:p>
+    <w:p/>
     <w:p>
       <w:pPr>
         <w:pStyle w:val="Heading3"/>
       </w:pPr>
-      <w:bookmarkStart w:id="185" w:name="_Toc90707498"/>
-      <w:bookmarkStart w:id="186" w:name="_Toc301780489"/>
-      <w:bookmarkStart w:id="187" w:name="_Toc301780803"/>
-      <w:bookmarkStart w:id="188" w:name="_Toc301780862"/>
-      <w:bookmarkStart w:id="189" w:name="_Toc301781610"/>
-      <w:bookmarkStart w:id="190" w:name="_Toc316270579"/>
-      <w:bookmarkStart w:id="191" w:name="_Toc317663754"/>
-      <w:r>
-        <w:t>Information and Control</w:t>
+      <w:bookmarkStart w:id="185" w:name="_Toc90707501"/>
+      <w:r>
+        <w:t>Document Status Accounting</w:t>
       </w:r>
       <w:bookmarkEnd w:id="185"/>
     </w:p>
-    <w:p>
-      <w:r>
-        <w:t xml:space="preserve"> </w:t>
+    <w:p/>
+    <w:p>
+      <w:r>
+        <w:t>[This section should describe how changes to the SCM plan are managed and reported.]</w:t>
+      </w:r>
+    </w:p>
+    <w:p/>
+    <w:p>
+      <w:pPr>
+        <w:pStyle w:val="Heading3"/>
+      </w:pPr>
+      <w:bookmarkStart w:id="186" w:name="_Toc90707502"/>
+      <w:r>
+        <w:t>Change Management Status Accounting</w:t>
       </w:r>
       <w:bookmarkEnd w:id="186"/>
+    </w:p>
+    <w:p/>
+    <w:p>
+      <w:r>
+        <w:t>[This section should describe the format, frequency, and process for reporting SCM change management status.  ]</w:t>
+      </w:r>
+    </w:p>
+    <w:p/>
+    <w:p>
+      <w:pPr>
+        <w:pStyle w:val="Heading2"/>
+      </w:pPr>
+      <w:bookmarkStart w:id="187" w:name="_Toc301780491"/>
+      <w:bookmarkStart w:id="188" w:name="_Toc301780805"/>
+      <w:bookmarkStart w:id="189" w:name="_Toc301780864"/>
+      <w:bookmarkStart w:id="190" w:name="_Toc301781612"/>
+      <w:bookmarkStart w:id="191" w:name="_Toc316270581"/>
+      <w:bookmarkStart w:id="192" w:name="_Toc317663756"/>
+      <w:bookmarkStart w:id="193" w:name="_Toc329577271"/>
+      <w:bookmarkStart w:id="194" w:name="_Toc340182605"/>
+      <w:bookmarkStart w:id="195" w:name="_Toc340284282"/>
+      <w:bookmarkStart w:id="196" w:name="_Toc90707503"/>
+      <w:r>
+        <w:t>Configuration Audits and Reviews</w:t>
+      </w:r>
       <w:bookmarkEnd w:id="187"/>
       <w:bookmarkEnd w:id="188"/>
       <w:bookmarkEnd w:id="189"/>
       <w:bookmarkEnd w:id="190"/>
       <w:bookmarkEnd w:id="191"/>
-    </w:p>
-    <w:p>
-      <w:pPr>
-        <w:pStyle w:val="Heading3"/>
-      </w:pPr>
-      <w:bookmarkStart w:id="192" w:name="_Toc90707499"/>
-      <w:r>
-        <w:t>Reporting</w:t>
-      </w:r>
       <w:bookmarkEnd w:id="192"/>
+      <w:bookmarkEnd w:id="193"/>
+      <w:bookmarkEnd w:id="194"/>
+      <w:bookmarkEnd w:id="195"/>
+      <w:bookmarkEnd w:id="196"/>
+      <w:r>
+        <w:t xml:space="preserve">    </w:t>
+      </w:r>
     </w:p>
     <w:p/>
     <w:p>
       <w:r>
-        <w:t xml:space="preserve">[This section should describe the format, frequency, and process for reporting SCM product baseline status.  Providing Configuration Items </w:t>
-      </w:r>
-      <w:proofErr w:type="gramStart"/>
-      <w:r>
-        <w:t>to</w:t>
-      </w:r>
-      <w:proofErr w:type="gramEnd"/>
-      <w:r>
-        <w:t xml:space="preserve"> testing may require a Test Item Transmittal Report.  This Test Item report should identify the person responsible for each item, the physical location of the item, and item status. The following is an example of status report of requested changes:</w:t>
+        <w:t>[This section should provide information in support of required configuration audits and reviews.  The following is provided as an example:</w:t>
       </w:r>
     </w:p>
     <w:p/>
     <w:p>
       <w:r>
-        <w:t xml:space="preserve">The status report of requested changes is available to the PM at any time.  A schedule status report may be provided to the CCB weekly and reported to [Company Name] senior management </w:t>
-      </w:r>
-      <w:proofErr w:type="gramStart"/>
-      <w:r>
-        <w:t>on a monthly basis</w:t>
-      </w:r>
-      <w:proofErr w:type="gramEnd"/>
-      <w:r>
-        <w:t>.  Please refer to the [Project Abbreviation] Software Development Plan, Section 6, for a status report schedule example.]</w:t>
-      </w:r>
+        <w:t>Each team PL reviews the software baseline semi-annually.  The [Project Abbreviation] PM and [Project Abbreviation] SCM review the baseline of each software product annually.  This baseline review consists of checking for CER implementation.  The CERs  are randomly selected.  Discrepancies will be annotated and reported to the PL.  Corrective action is taken if required.</w:t>
+      </w:r>
+    </w:p>
+    <w:p>
+      <w:pPr>
+        <w:jc w:val="both"/>
+      </w:pPr>
+      <w:r>
+        <w:t xml:space="preserve"> </w:t>
+      </w:r>
+    </w:p>
+    <w:p>
+      <w:r>
+        <w:lastRenderedPageBreak/>
+        <w:t>The [Project Abbreviation] CCB reviews the SCM process annually.  Randomly selected problem reports are identified and walked-through the change process.  Discrepancies are annotated and reported to the [Project Abbreviation] PM and [Project Abbreviation] SCM.  Corrective action is  taken if required.</w:t>
+      </w:r>
+    </w:p>
+    <w:p>
+      <w:pPr>
+        <w:jc w:val="both"/>
+      </w:pPr>
+    </w:p>
+    <w:p>
+      <w:r>
+        <w:t>A software baseline, the associated status reporting, and associated documentation for each software product is available for SQA review at all times.  ]</w:t>
+      </w:r>
+    </w:p>
+    <w:p>
+      <w:pPr>
+        <w:pStyle w:val="Heading1"/>
+      </w:pPr>
+      <w:bookmarkStart w:id="197" w:name="_Toc90707504"/>
+      <w:bookmarkStart w:id="198" w:name="_Toc301780492"/>
+      <w:bookmarkStart w:id="199" w:name="_Toc301780806"/>
+      <w:bookmarkStart w:id="200" w:name="_Toc301780865"/>
+      <w:bookmarkStart w:id="201" w:name="_Toc301781613"/>
+      <w:r>
+        <w:t>CM Milestones</w:t>
+      </w:r>
+      <w:bookmarkEnd w:id="197"/>
     </w:p>
     <w:p/>
     <w:p>
-      <w:pPr>
-        <w:pStyle w:val="Heading3"/>
-      </w:pPr>
-      <w:bookmarkStart w:id="193" w:name="_Toc90707500"/>
-      <w:r>
-        <w:t>Release process</w:t>
-      </w:r>
-      <w:bookmarkEnd w:id="193"/>
+      <w:r>
+        <w:t>[This section should provide a description of the minimum set of  SCM related project milestones that are acceptable for compliance.  These milestones should be reflected in the Software Project Management Plan schedule and resource allocation.]</w:t>
+      </w:r>
+    </w:p>
+    <w:p>
+      <w:pPr>
+        <w:pStyle w:val="Heading1"/>
+      </w:pPr>
+      <w:bookmarkStart w:id="202" w:name="_Toc90707505"/>
+      <w:r>
+        <w:t>Training</w:t>
+      </w:r>
+      <w:bookmarkEnd w:id="202"/>
     </w:p>
     <w:p/>
     <w:p>
       <w:r>
-        <w:t>[This section should describe the release process, including all required approvals.  A summary chart is sometimes used to describe the release process effectively.]</w:t>
-      </w:r>
-    </w:p>
-    <w:p/>
-    <w:p>
-      <w:pPr>
-        <w:pStyle w:val="Heading3"/>
-      </w:pPr>
-      <w:bookmarkStart w:id="194" w:name="_Toc90707501"/>
-      <w:r>
-        <w:t>Document Status Accounting</w:t>
-      </w:r>
-      <w:bookmarkEnd w:id="194"/>
-    </w:p>
-    <w:p/>
-    <w:p>
-      <w:r>
-        <w:lastRenderedPageBreak/>
-        <w:t>[This section should describe how changes to the SCM plan are managed and reported.]</w:t>
-      </w:r>
-    </w:p>
-    <w:p/>
-    <w:p>
-      <w:pPr>
-        <w:pStyle w:val="Heading3"/>
-      </w:pPr>
-      <w:bookmarkStart w:id="195" w:name="_Toc90707502"/>
-      <w:r>
-        <w:t>Change Management Status Accounting</w:t>
-      </w:r>
-      <w:bookmarkEnd w:id="195"/>
-    </w:p>
-    <w:p/>
-    <w:p>
-      <w:r>
-        <w:t>[This section should describe the format, frequency, and process for reporting SCM change management status.  ]</w:t>
-      </w:r>
-    </w:p>
-    <w:p/>
-    <w:p>
-      <w:pPr>
-        <w:pStyle w:val="Heading2"/>
-      </w:pPr>
-      <w:bookmarkStart w:id="196" w:name="_Toc301780491"/>
-      <w:bookmarkStart w:id="197" w:name="_Toc301780805"/>
-      <w:bookmarkStart w:id="198" w:name="_Toc301780864"/>
-      <w:bookmarkStart w:id="199" w:name="_Toc301781612"/>
-      <w:bookmarkStart w:id="200" w:name="_Toc316270581"/>
-      <w:bookmarkStart w:id="201" w:name="_Toc317663756"/>
-      <w:bookmarkStart w:id="202" w:name="_Toc329577271"/>
-      <w:bookmarkStart w:id="203" w:name="_Toc340182605"/>
-      <w:bookmarkStart w:id="204" w:name="_Toc340284282"/>
-      <w:bookmarkStart w:id="205" w:name="_Toc90707503"/>
-      <w:r>
-        <w:t>Configuration Audits and Reviews</w:t>
-      </w:r>
-      <w:bookmarkEnd w:id="196"/>
-      <w:bookmarkEnd w:id="197"/>
+        <w:t>[This section can refer to an independent training plan.  However, this training plan must include information relating specifically to SCM training.  If an independent plan does not exist, then information regarding the type and frequency of SCM training should be identified here.]</w:t>
+      </w:r>
+    </w:p>
+    <w:p>
+      <w:pPr>
+        <w:pStyle w:val="Heading1"/>
+      </w:pPr>
+      <w:bookmarkStart w:id="203" w:name="_Toc301780493"/>
+      <w:bookmarkStart w:id="204" w:name="_Toc301780807"/>
+      <w:bookmarkStart w:id="205" w:name="_Toc301780866"/>
+      <w:bookmarkStart w:id="206" w:name="_Toc301781614"/>
+      <w:bookmarkStart w:id="207" w:name="_Toc316270583"/>
+      <w:bookmarkStart w:id="208" w:name="_Toc317663758"/>
+      <w:bookmarkStart w:id="209" w:name="_Toc329577273"/>
+      <w:bookmarkStart w:id="210" w:name="_Toc340182607"/>
+      <w:bookmarkStart w:id="211" w:name="_Toc340284284"/>
       <w:bookmarkEnd w:id="198"/>
       <w:bookmarkEnd w:id="199"/>
       <w:bookmarkEnd w:id="200"/>
       <w:bookmarkEnd w:id="201"/>
-      <w:bookmarkEnd w:id="202"/>
+      <w:r>
+        <w:br w:type="page"/>
+      </w:r>
+      <w:bookmarkStart w:id="212" w:name="_Toc90707506"/>
+      <w:r>
+        <w:lastRenderedPageBreak/>
+        <w:t xml:space="preserve">Subcontractor/Vendor </w:t>
+      </w:r>
       <w:bookmarkEnd w:id="203"/>
       <w:bookmarkEnd w:id="204"/>
       <w:bookmarkEnd w:id="205"/>
-      <w:r>
-        <w:t xml:space="preserve">    </w:t>
-      </w:r>
-    </w:p>
-    <w:p/>
-    <w:p>
-      <w:r>
-        <w:t>[This section should provide information in support of required configuration audits and reviews.  The following is provided as an example:</w:t>
-      </w:r>
-    </w:p>
-    <w:p/>
-    <w:p>
-      <w:r>
-        <w:t>Each team PL reviews the software baseline semi-annually.  The [Project Abbreviation] PM and [Project Abbreviation] SCM review the baseline of each software product annually.  This baseline review consists of checking for CER implementation.  The CERs  are randomly selected.  Discrepancies will be annotated and reported to the PL.  Corrective action is taken if required.</w:t>
-      </w:r>
-    </w:p>
-    <w:p>
-      <w:pPr>
-        <w:jc w:val="both"/>
-      </w:pPr>
-      <w:r>
-        <w:t xml:space="preserve"> </w:t>
-      </w:r>
-    </w:p>
-    <w:p>
-      <w:r>
-        <w:t>The [Project Abbreviation] CCB reviews the SCM process annually.  Randomly selected problem reports are identified and walked-through the change process.  Discrepancies are annotated and reported to the [Project Abbreviation] PM and [Project Abbreviation] SCM.  Corrective action is  taken if required.</w:t>
-      </w:r>
-    </w:p>
-    <w:p>
-      <w:pPr>
-        <w:jc w:val="both"/>
-      </w:pPr>
-    </w:p>
-    <w:p>
-      <w:r>
-        <w:t>A software baseline, the associated status reporting, and associated documentation for each software product is available for SQA review at all times.  ]</w:t>
-      </w:r>
-    </w:p>
-    <w:p>
-      <w:pPr>
-        <w:pStyle w:val="Heading1"/>
-      </w:pPr>
-      <w:bookmarkStart w:id="206" w:name="_Toc90707504"/>
-      <w:bookmarkStart w:id="207" w:name="_Toc301780492"/>
-      <w:bookmarkStart w:id="208" w:name="_Toc301780806"/>
-      <w:bookmarkStart w:id="209" w:name="_Toc301780865"/>
-      <w:bookmarkStart w:id="210" w:name="_Toc301781613"/>
-      <w:r>
-        <w:t>CM Milestones</w:t>
-      </w:r>
       <w:bookmarkEnd w:id="206"/>
-    </w:p>
-    <w:p/>
-    <w:p>
-      <w:r>
-        <w:t>[This section should provide a description of the minimum set of  SCM related project milestones that are acceptable for compliance.  These milestones should be reflected in the Software Project Management Plan schedule and resource allocation.]</w:t>
-      </w:r>
-    </w:p>
-    <w:p>
-      <w:pPr>
-        <w:pStyle w:val="Heading1"/>
-      </w:pPr>
-      <w:bookmarkStart w:id="211" w:name="_Toc90707505"/>
-      <w:r>
-        <w:t>Training</w:t>
-      </w:r>
-      <w:bookmarkEnd w:id="211"/>
-    </w:p>
-    <w:p/>
-    <w:p>
-      <w:r>
-        <w:t>[This section can refer to an independent training plan.  However, this training plan must include information relating specifically to SCM training.  If an independent plan does not exist, then information regarding the type and frequency of SCM training should be identified here.]</w:t>
-      </w:r>
-    </w:p>
-    <w:p>
-      <w:pPr>
-        <w:pStyle w:val="Heading1"/>
-      </w:pPr>
-      <w:bookmarkStart w:id="212" w:name="_Toc301780493"/>
-      <w:bookmarkStart w:id="213" w:name="_Toc301780807"/>
-      <w:bookmarkStart w:id="214" w:name="_Toc301780866"/>
-      <w:bookmarkStart w:id="215" w:name="_Toc301781614"/>
-      <w:bookmarkStart w:id="216" w:name="_Toc316270583"/>
-      <w:bookmarkStart w:id="217" w:name="_Toc317663758"/>
-      <w:bookmarkStart w:id="218" w:name="_Toc329577273"/>
-      <w:bookmarkStart w:id="219" w:name="_Toc340182607"/>
-      <w:bookmarkStart w:id="220" w:name="_Toc340284284"/>
       <w:bookmarkEnd w:id="207"/>
       <w:bookmarkEnd w:id="208"/>
       <w:bookmarkEnd w:id="209"/>
       <w:bookmarkEnd w:id="210"/>
+      <w:bookmarkEnd w:id="211"/>
+      <w:r>
+        <w:t>Support</w:t>
+      </w:r>
+      <w:bookmarkEnd w:id="212"/>
+    </w:p>
+    <w:p/>
+    <w:p>
+      <w:r>
+        <w:t>[This section should describe the SCM activities required by subcontractors.  The following information is provided as a supporting example:</w:t>
+      </w:r>
+    </w:p>
+    <w:p/>
+    <w:p>
+      <w:r>
+        <w:t>[Project Abbreviation] subcontractor support will be identified by the [Project Abbreviation] Program Manager.  Subcontractor support will be required to follow the process defined in this document.  If a wavier is requested, the subcontractor must provide evidence of comparable configuration management procedures.  These procedures will follow the same audit and control procedures described in Section  4.4. ]</w:t>
+      </w:r>
+    </w:p>
+    <w:p/>
+    <w:p/>
+    <w:p>
+      <w:r>
+        <w:t xml:space="preserve">   </w:t>
+      </w:r>
       <w:r>
         <w:br w:type="page"/>
       </w:r>
-      <w:bookmarkStart w:id="221" w:name="_Toc90707506"/>
       <w:r>
         <w:lastRenderedPageBreak/>
-        <w:t xml:space="preserve">Subcontractor/Vendor </w:t>
-      </w:r>
-      <w:bookmarkEnd w:id="212"/>
+        <w:t xml:space="preserve">                                </w:t>
+      </w:r>
+    </w:p>
+    <w:p>
+      <w:pPr>
+        <w:pStyle w:val="TableofAuthorities"/>
+      </w:pPr>
+      <w:bookmarkStart w:id="213" w:name="_Toc301780497"/>
+      <w:bookmarkStart w:id="214" w:name="_Toc301780811"/>
+      <w:bookmarkStart w:id="215" w:name="_Toc301780870"/>
+      <w:bookmarkStart w:id="216" w:name="_Toc301781618"/>
+      <w:bookmarkStart w:id="217" w:name="_Toc316270587"/>
+      <w:bookmarkStart w:id="218" w:name="_Toc317663762"/>
+      <w:bookmarkStart w:id="219" w:name="_Toc329577277"/>
+      <w:bookmarkStart w:id="220" w:name="_Toc340182611"/>
+      <w:bookmarkStart w:id="221" w:name="_Toc340284288"/>
+      <w:r>
+        <w:t>APPENDIX A // Software Change Request Procedures</w:t>
+      </w:r>
       <w:bookmarkEnd w:id="213"/>
       <w:bookmarkEnd w:id="214"/>
       <w:bookmarkEnd w:id="215"/>
@@ -14221,62 +14206,7 @@
       <w:bookmarkEnd w:id="218"/>
       <w:bookmarkEnd w:id="219"/>
       <w:bookmarkEnd w:id="220"/>
-      <w:r>
-        <w:t>Support</w:t>
-      </w:r>
       <w:bookmarkEnd w:id="221"/>
-    </w:p>
-    <w:p/>
-    <w:p>
-      <w:r>
-        <w:t>[This section should describe the SCM activities required by subcontractors.  The following information is provided as a supporting example:</w:t>
-      </w:r>
-    </w:p>
-    <w:p/>
-    <w:p>
-      <w:r>
-        <w:t>[Project Abbreviation] subcontractor support will be identified by the [Project Abbreviation] Program Manager.  Subcontractor support will be required to follow the process defined in this document.  If a wavier is requested, the subcontractor must provide evidence of comparable configuration management procedures.  These procedures will follow the same audit and control procedures described in Section  4.4. ]</w:t>
-      </w:r>
-    </w:p>
-    <w:p/>
-    <w:p/>
-    <w:p>
-      <w:r>
-        <w:t xml:space="preserve">   </w:t>
-      </w:r>
-      <w:r>
-        <w:br w:type="page"/>
-      </w:r>
-      <w:r>
-        <w:lastRenderedPageBreak/>
-        <w:t xml:space="preserve">                                </w:t>
-      </w:r>
-    </w:p>
-    <w:p>
-      <w:pPr>
-        <w:pStyle w:val="TableofAuthorities"/>
-      </w:pPr>
-      <w:bookmarkStart w:id="222" w:name="_Toc301780497"/>
-      <w:bookmarkStart w:id="223" w:name="_Toc301780811"/>
-      <w:bookmarkStart w:id="224" w:name="_Toc301780870"/>
-      <w:bookmarkStart w:id="225" w:name="_Toc301781618"/>
-      <w:bookmarkStart w:id="226" w:name="_Toc316270587"/>
-      <w:bookmarkStart w:id="227" w:name="_Toc317663762"/>
-      <w:bookmarkStart w:id="228" w:name="_Toc329577277"/>
-      <w:bookmarkStart w:id="229" w:name="_Toc340182611"/>
-      <w:bookmarkStart w:id="230" w:name="_Toc340284288"/>
-      <w:r>
-        <w:t>APPENDIX A // Software Change Request Procedures</w:t>
-      </w:r>
-      <w:bookmarkEnd w:id="222"/>
-      <w:bookmarkEnd w:id="223"/>
-      <w:bookmarkEnd w:id="224"/>
-      <w:bookmarkEnd w:id="225"/>
-      <w:bookmarkEnd w:id="226"/>
-      <w:bookmarkEnd w:id="227"/>
-      <w:bookmarkEnd w:id="228"/>
-      <w:bookmarkEnd w:id="229"/>
-      <w:bookmarkEnd w:id="230"/>
       <w:r>
         <w:t xml:space="preserve">       </w:t>
       </w:r>
@@ -23614,18 +23544,47 @@
       <w:r>
         <w:br w:type="page"/>
       </w:r>
-      <w:bookmarkStart w:id="231" w:name="_Toc301780503"/>
-      <w:bookmarkStart w:id="232" w:name="_Toc301780817"/>
-      <w:bookmarkStart w:id="233" w:name="_Toc301780876"/>
-      <w:bookmarkStart w:id="234" w:name="_Toc301781624"/>
-      <w:bookmarkStart w:id="235" w:name="_Toc316270593"/>
-      <w:bookmarkStart w:id="236" w:name="_Toc317663768"/>
-      <w:bookmarkStart w:id="237" w:name="_Toc329577283"/>
-      <w:bookmarkStart w:id="238" w:name="_Toc340182615"/>
-      <w:bookmarkStart w:id="239" w:name="_Toc340284292"/>
+      <w:bookmarkStart w:id="222" w:name="_Toc301780503"/>
+      <w:bookmarkStart w:id="223" w:name="_Toc301780817"/>
+      <w:bookmarkStart w:id="224" w:name="_Toc301780876"/>
+      <w:bookmarkStart w:id="225" w:name="_Toc301781624"/>
+      <w:bookmarkStart w:id="226" w:name="_Toc316270593"/>
+      <w:bookmarkStart w:id="227" w:name="_Toc317663768"/>
+      <w:bookmarkStart w:id="228" w:name="_Toc329577283"/>
+      <w:bookmarkStart w:id="229" w:name="_Toc340182615"/>
+      <w:bookmarkStart w:id="230" w:name="_Toc340284292"/>
       <w:r>
         <w:lastRenderedPageBreak/>
         <w:t>APPENDIX B // [PROGRAM ABBREVIATION] Software Organization</w:t>
+      </w:r>
+      <w:bookmarkEnd w:id="222"/>
+      <w:bookmarkEnd w:id="223"/>
+      <w:bookmarkEnd w:id="224"/>
+      <w:bookmarkEnd w:id="225"/>
+      <w:bookmarkEnd w:id="226"/>
+      <w:bookmarkEnd w:id="227"/>
+      <w:bookmarkEnd w:id="228"/>
+      <w:bookmarkEnd w:id="229"/>
+      <w:bookmarkEnd w:id="230"/>
+    </w:p>
+    <w:p/>
+    <w:p>
+      <w:pPr>
+        <w:rPr>
+          <w:b/>
+        </w:rPr>
+      </w:pPr>
+      <w:bookmarkStart w:id="231" w:name="_Toc301780504"/>
+      <w:bookmarkStart w:id="232" w:name="_Toc301780818"/>
+      <w:bookmarkStart w:id="233" w:name="_Toc301780877"/>
+      <w:bookmarkStart w:id="234" w:name="_Toc301781625"/>
+      <w:bookmarkStart w:id="235" w:name="_Toc316270594"/>
+      <w:bookmarkStart w:id="236" w:name="_Toc317663769"/>
+      <w:r>
+        <w:rPr>
+          <w:b/>
+        </w:rPr>
+        <w:t>G.1  [PROGRAM ABBREVIATION] Organization</w:t>
       </w:r>
       <w:bookmarkEnd w:id="231"/>
       <w:bookmarkEnd w:id="232"/>
@@ -23633,35 +23592,6 @@
       <w:bookmarkEnd w:id="234"/>
       <w:bookmarkEnd w:id="235"/>
       <w:bookmarkEnd w:id="236"/>
-      <w:bookmarkEnd w:id="237"/>
-      <w:bookmarkEnd w:id="238"/>
-      <w:bookmarkEnd w:id="239"/>
-    </w:p>
-    <w:p/>
-    <w:p>
-      <w:pPr>
-        <w:rPr>
-          <w:b/>
-        </w:rPr>
-      </w:pPr>
-      <w:bookmarkStart w:id="240" w:name="_Toc301780504"/>
-      <w:bookmarkStart w:id="241" w:name="_Toc301780818"/>
-      <w:bookmarkStart w:id="242" w:name="_Toc301780877"/>
-      <w:bookmarkStart w:id="243" w:name="_Toc301781625"/>
-      <w:bookmarkStart w:id="244" w:name="_Toc316270594"/>
-      <w:bookmarkStart w:id="245" w:name="_Toc317663769"/>
-      <w:r>
-        <w:rPr>
-          <w:b/>
-        </w:rPr>
-        <w:t>G.1  [PROGRAM ABBREVIATION] Organization</w:t>
-      </w:r>
-      <w:bookmarkEnd w:id="240"/>
-      <w:bookmarkEnd w:id="241"/>
-      <w:bookmarkEnd w:id="242"/>
-      <w:bookmarkEnd w:id="243"/>
-      <w:bookmarkEnd w:id="244"/>
-      <w:bookmarkEnd w:id="245"/>
     </w:p>
     <w:p>
       <w:r>
@@ -23968,7 +23898,21 @@
         <w:b/>
         <w:i/>
       </w:rPr>
-      <w:t>[Date]</w:t>
+      <w:t>[</w:t>
+    </w:r>
+    <w:r>
+      <w:rPr>
+        <w:b/>
+        <w:i/>
+      </w:rPr>
+      <w:t>3/18/2026</w:t>
+    </w:r>
+    <w:r>
+      <w:rPr>
+        <w:b/>
+        <w:i/>
+      </w:rPr>
+      <w:t>]</w:t>
     </w:r>
     <w:r>
       <w:rPr>
@@ -23990,7 +23934,21 @@
         <w:i/>
       </w:rPr>
       <w:tab/>
-      <w:t>[Version]</w:t>
+      <w:t>[</w:t>
+    </w:r>
+    <w:r>
+      <w:rPr>
+        <w:b/>
+        <w:i/>
+      </w:rPr>
+      <w:t>1.3</w:t>
+    </w:r>
+    <w:r>
+      <w:rPr>
+        <w:b/>
+        <w:i/>
+      </w:rPr>
+      <w:t>]</w:t>
     </w:r>
   </w:p>
   <w:p>
@@ -24063,13 +24021,31 @@
         <w:tab w:val="left" w:pos="6120"/>
       </w:tabs>
       <w:ind w:right="360"/>
+      <w:rPr>
+        <w:b/>
+        <w:i/>
+      </w:rPr>
     </w:pPr>
     <w:r>
       <w:rPr>
         <w:b/>
         <w:i/>
       </w:rPr>
-      <w:t>[Date]</w:t>
+      <w:t>[</w:t>
+    </w:r>
+    <w:r>
+      <w:rPr>
+        <w:b/>
+        <w:i/>
+      </w:rPr>
+      <w:t>3/18/2026</w:t>
+    </w:r>
+    <w:r>
+      <w:rPr>
+        <w:b/>
+        <w:i/>
+      </w:rPr>
+      <w:t>]</w:t>
     </w:r>
     <w:r>
       <w:rPr>
@@ -24158,7 +24134,14 @@
         <w:b/>
         <w:i/>
       </w:rPr>
-      <w:t>[Project Name] Configuration Management Plan</w:t>
+      <w:t>Data Warehouse Team</w:t>
+    </w:r>
+    <w:r>
+      <w:rPr>
+        <w:b/>
+        <w:i/>
+      </w:rPr>
+      <w:t xml:space="preserve"> Configuration Management Plan</w:t>
     </w:r>
   </w:p>
   <w:p>

</xml_diff>